<commit_message>
Update project report with alphabetical group roster, academic cohort details, and formatted typography
</commit_message>
<xml_diff>
--- a/FileGuard_Project_Report.docx
+++ b/FileGuard_Project_Report.docx
@@ -4,13 +4,13 @@
   <w:body>
     <w:p>
       <w:pPr>
-        <w:spacing w:after="40" w:before="0"/>
+        <w:spacing w:before="0" w:after="40"/>
       </w:pPr>
       <w:r>
         <w:rPr>
           <w:b/>
           <w:color w:val="0F172A"/>
-          <w:sz w:val="34"/>
+          <w:sz w:val="32"/>
         </w:rPr>
         <w:t>FILEGUARD: SECURE EPHEMERAL FILE SHARING SYSTEM</w:t>
       </w:r>
@@ -25,7 +25,7 @@
           <w:color w:val="0284C7"/>
           <w:sz w:val="22"/>
         </w:rPr>
-        <w:t>Technical Architecture, Cryptographic Integrity Verification &amp; Forensic Telemetry</w:t>
+        <w:t>Cryptographic Integrity Monitoring, Digital Forensics &amp; Ephemeral Cloud Architecture</w:t>
       </w:r>
     </w:p>
     <w:tbl>
@@ -36,19 +36,19 @@
         <w:tblLook w:firstColumn="1" w:firstRow="1" w:lastColumn="0" w:lastRow="0" w:noHBand="0" w:noVBand="1" w:val="04A0"/>
       </w:tblPr>
       <w:tblGrid>
-        <w:gridCol w:w="5112"/>
-        <w:gridCol w:w="5112"/>
+        <w:gridCol w:w="5040"/>
+        <w:gridCol w:w="5040"/>
       </w:tblGrid>
       <w:tr>
         <w:tc>
           <w:tcPr>
-            <w:tcW w:type="dxa" w:w="5040"/>
-            <w:shd w:fill="F1F5F9"/>
+            <w:tcW w:type="dxa" w:w="4968"/>
+            <w:shd w:fill="F8FAFC"/>
             <w:tcMar>
-              <w:top w:w="60" w:type="dxa"/>
-              <w:bottom w:w="60" w:type="dxa"/>
-              <w:left w:w="100" w:type="dxa"/>
-              <w:right w:w="100" w:type="dxa"/>
+              <w:top w:w="50" w:type="dxa"/>
+              <w:bottom w:w="50" w:type="dxa"/>
+              <w:left w:w="90" w:type="dxa"/>
+              <w:right w:w="90" w:type="dxa"/>
             </w:tcMar>
           </w:tcPr>
           <w:p>
@@ -60,25 +60,25 @@
                 <w:b/>
                 <w:sz w:val="17"/>
               </w:rPr>
-              <w:t>Course / Domain:</w:t>
+              <w:t>Course &amp; Subject:</w:t>
             </w:r>
             <w:r>
               <w:rPr>
                 <w:sz w:val="17"/>
               </w:rPr>
-              <w:t xml:space="preserve"> Information &amp; Network Security (INS::2026)</w:t>
+              <w:t xml:space="preserve"> Information &amp; Network Security (INS)</w:t>
             </w:r>
           </w:p>
         </w:tc>
         <w:tc>
           <w:tcPr>
-            <w:tcW w:type="dxa" w:w="5184"/>
-            <w:shd w:fill="F1F5F9"/>
+            <w:tcW w:type="dxa" w:w="5112"/>
+            <w:shd w:fill="F8FAFC"/>
             <w:tcMar>
-              <w:top w:w="60" w:type="dxa"/>
-              <w:bottom w:w="60" w:type="dxa"/>
-              <w:left w:w="100" w:type="dxa"/>
-              <w:right w:w="100" w:type="dxa"/>
+              <w:top w:w="50" w:type="dxa"/>
+              <w:bottom w:w="50" w:type="dxa"/>
+              <w:left w:w="90" w:type="dxa"/>
+              <w:right w:w="90" w:type="dxa"/>
             </w:tcMar>
           </w:tcPr>
           <w:p>
@@ -90,13 +90,13 @@
                 <w:b/>
                 <w:sz w:val="17"/>
               </w:rPr>
-              <w:t>Live Production URL:</w:t>
+              <w:t>Class &amp; Cohort:</w:t>
             </w:r>
             <w:r>
               <w:rPr>
                 <w:sz w:val="17"/>
               </w:rPr>
-              <w:t xml:space="preserve"> https://files.deeptanil.in</w:t>
+              <w:t xml:space="preserve"> Class: IT-A, Semester - V, Year 3</w:t>
             </w:r>
           </w:p>
         </w:tc>
@@ -104,13 +104,13 @@
       <w:tr>
         <w:tc>
           <w:tcPr>
-            <w:tcW w:type="dxa" w:w="5040"/>
-            <w:shd w:fill="F1F5F9"/>
+            <w:tcW w:type="dxa" w:w="4968"/>
+            <w:shd w:fill="FFFFFF"/>
             <w:tcMar>
-              <w:top w:w="60" w:type="dxa"/>
-              <w:bottom w:w="60" w:type="dxa"/>
-              <w:left w:w="100" w:type="dxa"/>
-              <w:right w:w="100" w:type="dxa"/>
+              <w:top w:w="50" w:type="dxa"/>
+              <w:bottom w:w="50" w:type="dxa"/>
+              <w:left w:w="90" w:type="dxa"/>
+              <w:right w:w="90" w:type="dxa"/>
             </w:tcMar>
           </w:tcPr>
           <w:p>
@@ -122,25 +122,87 @@
                 <w:b/>
                 <w:sz w:val="17"/>
               </w:rPr>
-              <w:t>Core Stack:</w:t>
+              <w:t>Group Member 1 (Alpha):</w:t>
             </w:r>
             <w:r>
               <w:rPr>
                 <w:sz w:val="17"/>
               </w:rPr>
-              <w:t xml:space="preserve"> Python 3.14, Flask, PostgreSQL, B2 S3</w:t>
+              <w:t xml:space="preserve"> Aaditya Abhijit (Student ID: 245811404)</w:t>
             </w:r>
           </w:p>
         </w:tc>
         <w:tc>
           <w:tcPr>
-            <w:tcW w:type="dxa" w:w="5184"/>
-            <w:shd w:fill="F1F5F9"/>
+            <w:tcW w:type="dxa" w:w="5112"/>
+            <w:shd w:fill="FFFFFF"/>
             <w:tcMar>
-              <w:top w:w="60" w:type="dxa"/>
-              <w:bottom w:w="60" w:type="dxa"/>
-              <w:left w:w="100" w:type="dxa"/>
-              <w:right w:w="100" w:type="dxa"/>
+              <w:top w:w="50" w:type="dxa"/>
+              <w:bottom w:w="50" w:type="dxa"/>
+              <w:left w:w="90" w:type="dxa"/>
+              <w:right w:w="90" w:type="dxa"/>
+            </w:tcMar>
+          </w:tcPr>
+          <w:p>
+            <w:pPr>
+              <w:spacing w:after="0"/>
+            </w:pPr>
+            <w:r>
+              <w:rPr>
+                <w:b/>
+                <w:sz w:val="17"/>
+              </w:rPr>
+              <w:t>Group Member 2 (Alpha):</w:t>
+            </w:r>
+            <w:r>
+              <w:rPr>
+                <w:sz w:val="17"/>
+              </w:rPr>
+              <w:t xml:space="preserve"> Deeptanil Sinha (Student ID: 245811402)</w:t>
+            </w:r>
+          </w:p>
+        </w:tc>
+      </w:tr>
+      <w:tr>
+        <w:tc>
+          <w:tcPr>
+            <w:tcW w:type="dxa" w:w="4968"/>
+            <w:shd w:fill="F8FAFC"/>
+            <w:tcMar>
+              <w:top w:w="50" w:type="dxa"/>
+              <w:bottom w:w="50" w:type="dxa"/>
+              <w:left w:w="90" w:type="dxa"/>
+              <w:right w:w="90" w:type="dxa"/>
+            </w:tcMar>
+          </w:tcPr>
+          <w:p>
+            <w:pPr>
+              <w:spacing w:after="0"/>
+            </w:pPr>
+            <w:r>
+              <w:rPr>
+                <w:b/>
+                <w:sz w:val="17"/>
+              </w:rPr>
+              <w:t>Live Production System:</w:t>
+            </w:r>
+            <w:r>
+              <w:rPr>
+                <w:sz w:val="17"/>
+              </w:rPr>
+              <w:t xml:space="preserve"> https://files.deeptanil.in</w:t>
+            </w:r>
+          </w:p>
+        </w:tc>
+        <w:tc>
+          <w:tcPr>
+            <w:tcW w:type="dxa" w:w="5112"/>
+            <w:shd w:fill="F8FAFC"/>
+            <w:tcMar>
+              <w:top w:w="50" w:type="dxa"/>
+              <w:bottom w:w="50" w:type="dxa"/>
+              <w:left w:w="90" w:type="dxa"/>
+              <w:right w:w="90" w:type="dxa"/>
             </w:tcMar>
           </w:tcPr>
           <w:p>
@@ -163,6 +225,68 @@
           </w:p>
         </w:tc>
       </w:tr>
+      <w:tr>
+        <w:tc>
+          <w:tcPr>
+            <w:tcW w:type="dxa" w:w="4968"/>
+            <w:shd w:fill="FFFFFF"/>
+            <w:tcMar>
+              <w:top w:w="50" w:type="dxa"/>
+              <w:bottom w:w="50" w:type="dxa"/>
+              <w:left w:w="90" w:type="dxa"/>
+              <w:right w:w="90" w:type="dxa"/>
+            </w:tcMar>
+          </w:tcPr>
+          <w:p>
+            <w:pPr>
+              <w:spacing w:after="0"/>
+            </w:pPr>
+            <w:r>
+              <w:rPr>
+                <w:b/>
+                <w:sz w:val="17"/>
+              </w:rPr>
+              <w:t>Deployment Environment:</w:t>
+            </w:r>
+            <w:r>
+              <w:rPr>
+                <w:sz w:val="17"/>
+              </w:rPr>
+              <w:t xml:space="preserve"> Render Web Service, Neon PostgreSQL, Backblaze B2 S3</w:t>
+            </w:r>
+          </w:p>
+        </w:tc>
+        <w:tc>
+          <w:tcPr>
+            <w:tcW w:type="dxa" w:w="5112"/>
+            <w:shd w:fill="FFFFFF"/>
+            <w:tcMar>
+              <w:top w:w="50" w:type="dxa"/>
+              <w:bottom w:w="50" w:type="dxa"/>
+              <w:left w:w="90" w:type="dxa"/>
+              <w:right w:w="90" w:type="dxa"/>
+            </w:tcMar>
+          </w:tcPr>
+          <w:p>
+            <w:pPr>
+              <w:spacing w:after="0"/>
+            </w:pPr>
+            <w:r>
+              <w:rPr>
+                <w:b/>
+                <w:sz w:val="17"/>
+              </w:rPr>
+              <w:t>Security Test Suite:</w:t>
+            </w:r>
+            <w:r>
+              <w:rPr>
+                <w:sz w:val="17"/>
+              </w:rPr>
+              <w:t xml:space="preserve"> 43 Automated Pytest Tests (100% Pass Rate)</w:t>
+            </w:r>
+          </w:p>
+        </w:tc>
+      </w:tr>
     </w:tbl>
     <w:p>
       <w:pPr>
@@ -172,9 +296,9 @@
     <w:p>
       <w:pPr>
         <w:keepNext/>
-        <w:spacing w:before="200" w:after="60"/>
+        <w:spacing w:before="160" w:after="60"/>
         <w:pBdr>
-          <w:bottom w:val="single" w:sz="8" w:space="2" w:color="0284C7"/>
+          <w:bottom w:val="single" w:sz="6" w:space="2" w:color="0284C7"/>
         </w:pBdr>
       </w:pPr>
       <w:r>
@@ -183,20 +307,20 @@
           <w:color w:val="0F172A"/>
           <w:sz w:val="24"/>
         </w:rPr>
-        <w:t>1. Executive Summary &amp; Problem Formulation</w:t>
+        <w:t>1. Abstract &amp; Problem Statement</w:t>
       </w:r>
     </w:p>
     <w:p>
       <w:r>
-        <w:t>Modern cloud file-transfer utilities suffer from three critical architectural flaws: (1) silent data degradation and undetectable bit-rot, (2) 'ghost file persistence' where expired assets linger on remote disks for weeks, and (3) pervasive tracking requiring mandatory user registration and cookie surveillance. FileGuard resolves these vulnerabilities by pairing an authoritative 12-hour ephemeral lifecycle with a pre-flight cryptographic gate that guarantees zero-knowledge anonymity, bit-level integrity, and immediate multi-cloud storage purging.</w:t>
+        <w:t>Temporary file transmission across open networks presents critical security vulnerabilities: persistent data exposure on remote servers, silent data corruption (bit-rot or malicious in-flight modification), unauthorized token enumeration, and intrusive user tracking. FileGuard is an academic and production-engineered web platform providing zero-knowledge temporary file sharing. It implements a strict 12-hour self-destruct lifecycle, pre-flight SHA-256 cryptographic verification, in-memory folder ZIP bundling, CIDR-masked subnet quota controls, and a digital forensics inspection lab.</w:t>
       </w:r>
     </w:p>
     <w:p>
       <w:pPr>
         <w:keepNext/>
-        <w:spacing w:before="200" w:after="60"/>
+        <w:spacing w:before="160" w:after="60"/>
         <w:pBdr>
-          <w:bottom w:val="single" w:sz="8" w:space="2" w:color="0284C7"/>
+          <w:bottom w:val="single" w:sz="6" w:space="2" w:color="0284C7"/>
         </w:pBdr>
       </w:pPr>
       <w:r>
@@ -205,12 +329,12 @@
           <w:color w:val="0F172A"/>
           <w:sz w:val="24"/>
         </w:rPr>
-        <w:t>2. System Architecture &amp; Core Specifications</w:t>
+        <w:t>2. Architectural Overview &amp; Subsystem Specifications</w:t>
       </w:r>
     </w:p>
     <w:p>
       <w:r>
-        <w:t>FileGuard is architected as an asynchronous, defensive gateway coordinating application-layer security, relational state, and S3-compatible cloud object storage.</w:t>
+        <w:t>The system coordinates web routing, object storage, and relational state without disk bottlenecks or unencrypted staging leaks:</w:t>
       </w:r>
     </w:p>
     <w:tbl>
@@ -220,20 +344,20 @@
         <w:tblLook w:firstColumn="1" w:firstRow="1" w:lastColumn="0" w:lastRow="0" w:noHBand="0" w:noVBand="1" w:val="04A0"/>
       </w:tblPr>
       <w:tblGrid>
-        <w:gridCol w:w="3408"/>
-        <w:gridCol w:w="3408"/>
-        <w:gridCol w:w="3408"/>
+        <w:gridCol w:w="3360"/>
+        <w:gridCol w:w="3360"/>
+        <w:gridCol w:w="3360"/>
       </w:tblGrid>
       <w:tr>
         <w:tc>
           <w:tcPr>
-            <w:tcW w:type="dxa" w:w="3408"/>
+            <w:tcW w:type="dxa" w:w="3360"/>
             <w:shd w:fill="0F172A"/>
             <w:tcMar>
-              <w:top w:w="80" w:type="dxa"/>
-              <w:bottom w:w="80" w:type="dxa"/>
-              <w:left w:w="100" w:type="dxa"/>
-              <w:right w:w="100" w:type="dxa"/>
+              <w:top w:w="60" w:type="dxa"/>
+              <w:bottom w:w="60" w:type="dxa"/>
+              <w:left w:w="90" w:type="dxa"/>
+              <w:right w:w="90" w:type="dxa"/>
             </w:tcMar>
           </w:tcPr>
           <w:p>
@@ -252,13 +376,13 @@
         </w:tc>
         <w:tc>
           <w:tcPr>
-            <w:tcW w:type="dxa" w:w="3408"/>
+            <w:tcW w:type="dxa" w:w="3360"/>
             <w:shd w:fill="0F172A"/>
             <w:tcMar>
-              <w:top w:w="80" w:type="dxa"/>
-              <w:bottom w:w="80" w:type="dxa"/>
-              <w:left w:w="100" w:type="dxa"/>
-              <w:right w:w="100" w:type="dxa"/>
+              <w:top w:w="60" w:type="dxa"/>
+              <w:bottom w:w="60" w:type="dxa"/>
+              <w:left w:w="90" w:type="dxa"/>
+              <w:right w:w="90" w:type="dxa"/>
             </w:tcMar>
           </w:tcPr>
           <w:p>
@@ -271,19 +395,19 @@
                 <w:color w:val="FFFFFF"/>
                 <w:sz w:val="17"/>
               </w:rPr>
-              <w:t>Engineering Technology</w:t>
+              <w:t>Core Technology</w:t>
             </w:r>
           </w:p>
         </w:tc>
         <w:tc>
           <w:tcPr>
-            <w:tcW w:type="dxa" w:w="3408"/>
+            <w:tcW w:type="dxa" w:w="3360"/>
             <w:shd w:fill="0F172A"/>
             <w:tcMar>
-              <w:top w:w="80" w:type="dxa"/>
-              <w:bottom w:w="80" w:type="dxa"/>
-              <w:left w:w="100" w:type="dxa"/>
-              <w:right w:w="100" w:type="dxa"/>
+              <w:top w:w="60" w:type="dxa"/>
+              <w:bottom w:w="60" w:type="dxa"/>
+              <w:left w:w="90" w:type="dxa"/>
+              <w:right w:w="90" w:type="dxa"/>
             </w:tcMar>
           </w:tcPr>
           <w:p>
@@ -296,7 +420,7 @@
                 <w:color w:val="FFFFFF"/>
                 <w:sz w:val="17"/>
               </w:rPr>
-              <w:t>Security Function &amp; Standard</w:t>
+              <w:t>Security Function &amp; Implementation</w:t>
             </w:r>
           </w:p>
         </w:tc>
@@ -304,13 +428,13 @@
       <w:tr>
         <w:tc>
           <w:tcPr>
-            <w:tcW w:type="dxa" w:w="2304"/>
+            <w:tcW w:type="dxa" w:w="2160"/>
             <w:shd w:fill="F8FAFC"/>
             <w:tcMar>
-              <w:top w:w="60" w:type="dxa"/>
-              <w:bottom w:w="60" w:type="dxa"/>
-              <w:left w:w="100" w:type="dxa"/>
-              <w:right w:w="100" w:type="dxa"/>
+              <w:top w:w="50" w:type="dxa"/>
+              <w:bottom w:w="50" w:type="dxa"/>
+              <w:left w:w="90" w:type="dxa"/>
+              <w:right w:w="90" w:type="dxa"/>
             </w:tcMar>
           </w:tcPr>
           <w:p>
@@ -321,19 +445,19 @@
               <w:rPr>
                 <w:sz w:val="17"/>
               </w:rPr>
-              <w:t>Gateway Runtime</w:t>
+              <w:t>Application Gateway</w:t>
             </w:r>
           </w:p>
         </w:tc>
         <w:tc>
           <w:tcPr>
-            <w:tcW w:type="dxa" w:w="3312"/>
+            <w:tcW w:type="dxa" w:w="3168"/>
             <w:shd w:fill="F8FAFC"/>
             <w:tcMar>
-              <w:top w:w="60" w:type="dxa"/>
-              <w:bottom w:w="60" w:type="dxa"/>
-              <w:left w:w="100" w:type="dxa"/>
-              <w:right w:w="100" w:type="dxa"/>
+              <w:top w:w="50" w:type="dxa"/>
+              <w:bottom w:w="50" w:type="dxa"/>
+              <w:left w:w="90" w:type="dxa"/>
+              <w:right w:w="90" w:type="dxa"/>
             </w:tcMar>
           </w:tcPr>
           <w:p>
@@ -350,13 +474,13 @@
         </w:tc>
         <w:tc>
           <w:tcPr>
-            <w:tcW w:type="dxa" w:w="4608"/>
+            <w:tcW w:type="dxa" w:w="4752"/>
             <w:shd w:fill="F8FAFC"/>
             <w:tcMar>
-              <w:top w:w="60" w:type="dxa"/>
-              <w:bottom w:w="60" w:type="dxa"/>
-              <w:left w:w="100" w:type="dxa"/>
-              <w:right w:w="100" w:type="dxa"/>
+              <w:top w:w="50" w:type="dxa"/>
+              <w:bottom w:w="50" w:type="dxa"/>
+              <w:left w:w="90" w:type="dxa"/>
+              <w:right w:w="90" w:type="dxa"/>
             </w:tcMar>
           </w:tcPr>
           <w:p>
@@ -367,7 +491,7 @@
               <w:rPr>
                 <w:sz w:val="17"/>
               </w:rPr>
-              <w:t>Strict CSPRNG tokenization, CSRF, and nosniff enforcement</w:t>
+              <w:t>Enforces CSPRNG tokenization, CSRF tokens, nosniff headers</w:t>
             </w:r>
           </w:p>
         </w:tc>
@@ -375,13 +499,13 @@
       <w:tr>
         <w:tc>
           <w:tcPr>
-            <w:tcW w:type="dxa" w:w="2304"/>
+            <w:tcW w:type="dxa" w:w="2160"/>
             <w:shd w:fill="FFFFFF"/>
             <w:tcMar>
-              <w:top w:w="60" w:type="dxa"/>
-              <w:bottom w:w="60" w:type="dxa"/>
-              <w:left w:w="100" w:type="dxa"/>
-              <w:right w:w="100" w:type="dxa"/>
+              <w:top w:w="50" w:type="dxa"/>
+              <w:bottom w:w="50" w:type="dxa"/>
+              <w:left w:w="90" w:type="dxa"/>
+              <w:right w:w="90" w:type="dxa"/>
             </w:tcMar>
           </w:tcPr>
           <w:p>
@@ -398,13 +522,13 @@
         </w:tc>
         <w:tc>
           <w:tcPr>
-            <w:tcW w:type="dxa" w:w="3312"/>
+            <w:tcW w:type="dxa" w:w="3168"/>
             <w:shd w:fill="FFFFFF"/>
             <w:tcMar>
-              <w:top w:w="60" w:type="dxa"/>
-              <w:bottom w:w="60" w:type="dxa"/>
-              <w:left w:w="100" w:type="dxa"/>
-              <w:right w:w="100" w:type="dxa"/>
+              <w:top w:w="50" w:type="dxa"/>
+              <w:bottom w:w="50" w:type="dxa"/>
+              <w:left w:w="90" w:type="dxa"/>
+              <w:right w:w="90" w:type="dxa"/>
             </w:tcMar>
           </w:tcPr>
           <w:p>
@@ -421,13 +545,13 @@
         </w:tc>
         <w:tc>
           <w:tcPr>
-            <w:tcW w:type="dxa" w:w="4608"/>
+            <w:tcW w:type="dxa" w:w="4752"/>
             <w:shd w:fill="FFFFFF"/>
             <w:tcMar>
-              <w:top w:w="60" w:type="dxa"/>
-              <w:bottom w:w="60" w:type="dxa"/>
-              <w:left w:w="100" w:type="dxa"/>
-              <w:right w:w="100" w:type="dxa"/>
+              <w:top w:w="50" w:type="dxa"/>
+              <w:bottom w:w="50" w:type="dxa"/>
+              <w:left w:w="90" w:type="dxa"/>
+              <w:right w:w="90" w:type="dxa"/>
             </w:tcMar>
           </w:tcPr>
           <w:p>
@@ -438,7 +562,7 @@
               <w:rPr>
                 <w:sz w:val="17"/>
               </w:rPr>
-              <w:t>Stores SHA-256 token hashes &amp; authoritative UTC deadlines</w:t>
+              <w:t>Stores SHA-256 token hashes, storage UUIDs, expiration timestamps</w:t>
             </w:r>
           </w:p>
         </w:tc>
@@ -446,13 +570,13 @@
       <w:tr>
         <w:tc>
           <w:tcPr>
-            <w:tcW w:type="dxa" w:w="2304"/>
+            <w:tcW w:type="dxa" w:w="2160"/>
             <w:shd w:fill="F8FAFC"/>
             <w:tcMar>
-              <w:top w:w="60" w:type="dxa"/>
-              <w:bottom w:w="60" w:type="dxa"/>
-              <w:left w:w="100" w:type="dxa"/>
-              <w:right w:w="100" w:type="dxa"/>
+              <w:top w:w="50" w:type="dxa"/>
+              <w:bottom w:w="50" w:type="dxa"/>
+              <w:left w:w="90" w:type="dxa"/>
+              <w:right w:w="90" w:type="dxa"/>
             </w:tcMar>
           </w:tcPr>
           <w:p>
@@ -463,19 +587,19 @@
               <w:rPr>
                 <w:sz w:val="17"/>
               </w:rPr>
-              <w:t>Object Storage</w:t>
+              <w:t>Cloud Storage</w:t>
             </w:r>
           </w:p>
         </w:tc>
         <w:tc>
           <w:tcPr>
-            <w:tcW w:type="dxa" w:w="3312"/>
+            <w:tcW w:type="dxa" w:w="3168"/>
             <w:shd w:fill="F8FAFC"/>
             <w:tcMar>
-              <w:top w:w="60" w:type="dxa"/>
-              <w:bottom w:w="60" w:type="dxa"/>
-              <w:left w:w="100" w:type="dxa"/>
-              <w:right w:w="100" w:type="dxa"/>
+              <w:top w:w="50" w:type="dxa"/>
+              <w:bottom w:w="50" w:type="dxa"/>
+              <w:left w:w="90" w:type="dxa"/>
+              <w:right w:w="90" w:type="dxa"/>
             </w:tcMar>
           </w:tcPr>
           <w:p>
@@ -492,13 +616,13 @@
         </w:tc>
         <w:tc>
           <w:tcPr>
-            <w:tcW w:type="dxa" w:w="4608"/>
+            <w:tcW w:type="dxa" w:w="4752"/>
             <w:shd w:fill="F8FAFC"/>
             <w:tcMar>
-              <w:top w:w="60" w:type="dxa"/>
-              <w:bottom w:w="60" w:type="dxa"/>
-              <w:left w:w="100" w:type="dxa"/>
-              <w:right w:w="100" w:type="dxa"/>
+              <w:top w:w="50" w:type="dxa"/>
+              <w:bottom w:w="50" w:type="dxa"/>
+              <w:left w:w="90" w:type="dxa"/>
+              <w:right w:w="90" w:type="dxa"/>
             </w:tcMar>
           </w:tcPr>
           <w:p>
@@ -509,7 +633,7 @@
               <w:rPr>
                 <w:sz w:val="17"/>
               </w:rPr>
-              <w:t>Parallel chunk streaming (10 threads, 256 KB memory buffer)</w:t>
+              <w:t>Multi-threaded multipart streaming (10 threads, 256 KB memory buffer)</w:t>
             </w:r>
           </w:p>
         </w:tc>
@@ -517,13 +641,13 @@
       <w:tr>
         <w:tc>
           <w:tcPr>
-            <w:tcW w:type="dxa" w:w="2304"/>
+            <w:tcW w:type="dxa" w:w="2160"/>
             <w:shd w:fill="FFFFFF"/>
             <w:tcMar>
-              <w:top w:w="60" w:type="dxa"/>
-              <w:bottom w:w="60" w:type="dxa"/>
-              <w:left w:w="100" w:type="dxa"/>
-              <w:right w:w="100" w:type="dxa"/>
+              <w:top w:w="50" w:type="dxa"/>
+              <w:bottom w:w="50" w:type="dxa"/>
+              <w:left w:w="90" w:type="dxa"/>
+              <w:right w:w="90" w:type="dxa"/>
             </w:tcMar>
           </w:tcPr>
           <w:p>
@@ -534,19 +658,19 @@
               <w:rPr>
                 <w:sz w:val="17"/>
               </w:rPr>
-              <w:t>Integrity Gate</w:t>
+              <w:t>Integrity Engine</w:t>
             </w:r>
           </w:p>
         </w:tc>
         <w:tc>
           <w:tcPr>
-            <w:tcW w:type="dxa" w:w="3312"/>
+            <w:tcW w:type="dxa" w:w="3168"/>
             <w:shd w:fill="FFFFFF"/>
             <w:tcMar>
-              <w:top w:w="60" w:type="dxa"/>
-              <w:bottom w:w="60" w:type="dxa"/>
-              <w:left w:w="100" w:type="dxa"/>
-              <w:right w:w="100" w:type="dxa"/>
+              <w:top w:w="50" w:type="dxa"/>
+              <w:bottom w:w="50" w:type="dxa"/>
+              <w:left w:w="90" w:type="dxa"/>
+              <w:right w:w="90" w:type="dxa"/>
             </w:tcMar>
           </w:tcPr>
           <w:p>
@@ -557,19 +681,19 @@
               <w:rPr>
                 <w:sz w:val="17"/>
               </w:rPr>
-              <w:t>SHA-256 Pre-Flight Engine</w:t>
+              <w:t>SHA-256 Pre-Flight Gate</w:t>
             </w:r>
           </w:p>
         </w:tc>
         <w:tc>
           <w:tcPr>
-            <w:tcW w:type="dxa" w:w="4608"/>
+            <w:tcW w:type="dxa" w:w="4752"/>
             <w:shd w:fill="FFFFFF"/>
             <w:tcMar>
-              <w:top w:w="60" w:type="dxa"/>
-              <w:bottom w:w="60" w:type="dxa"/>
-              <w:left w:w="100" w:type="dxa"/>
-              <w:right w:w="100" w:type="dxa"/>
+              <w:top w:w="50" w:type="dxa"/>
+              <w:bottom w:w="50" w:type="dxa"/>
+              <w:left w:w="90" w:type="dxa"/>
+              <w:right w:w="90" w:type="dxa"/>
             </w:tcMar>
           </w:tcPr>
           <w:p>
@@ -580,7 +704,7 @@
               <w:rPr>
                 <w:sz w:val="17"/>
               </w:rPr>
-              <w:t>Dynamic bit-level validation halting modified downloads (HTTP 409)</w:t>
+              <w:t>Dynamic byte-level hash verification halting altered downloads (HTTP 409)</w:t>
             </w:r>
           </w:p>
         </w:tc>
@@ -588,13 +712,13 @@
       <w:tr>
         <w:tc>
           <w:tcPr>
-            <w:tcW w:type="dxa" w:w="2304"/>
+            <w:tcW w:type="dxa" w:w="2160"/>
             <w:shd w:fill="F8FAFC"/>
             <w:tcMar>
-              <w:top w:w="60" w:type="dxa"/>
-              <w:bottom w:w="60" w:type="dxa"/>
-              <w:left w:w="100" w:type="dxa"/>
-              <w:right w:w="100" w:type="dxa"/>
+              <w:top w:w="50" w:type="dxa"/>
+              <w:bottom w:w="50" w:type="dxa"/>
+              <w:left w:w="90" w:type="dxa"/>
+              <w:right w:w="90" w:type="dxa"/>
             </w:tcMar>
           </w:tcPr>
           <w:p>
@@ -605,19 +729,19 @@
               <w:rPr>
                 <w:sz w:val="17"/>
               </w:rPr>
-              <w:t>Subnet Gate</w:t>
+              <w:t>Abuse Mitigation</w:t>
             </w:r>
           </w:p>
         </w:tc>
         <w:tc>
           <w:tcPr>
-            <w:tcW w:type="dxa" w:w="3312"/>
+            <w:tcW w:type="dxa" w:w="3168"/>
             <w:shd w:fill="F8FAFC"/>
             <w:tcMar>
-              <w:top w:w="60" w:type="dxa"/>
-              <w:bottom w:w="60" w:type="dxa"/>
-              <w:left w:w="100" w:type="dxa"/>
-              <w:right w:w="100" w:type="dxa"/>
+              <w:top w:w="50" w:type="dxa"/>
+              <w:bottom w:w="50" w:type="dxa"/>
+              <w:left w:w="90" w:type="dxa"/>
+              <w:right w:w="90" w:type="dxa"/>
             </w:tcMar>
           </w:tcPr>
           <w:p>
@@ -628,19 +752,19 @@
               <w:rPr>
                 <w:sz w:val="17"/>
               </w:rPr>
-              <w:t>Flask-Limiter / CIDR Masking</w:t>
+              <w:t>Flask-Limiter / Subnet Masking</w:t>
             </w:r>
           </w:p>
         </w:tc>
         <w:tc>
           <w:tcPr>
-            <w:tcW w:type="dxa" w:w="4608"/>
+            <w:tcW w:type="dxa" w:w="4752"/>
             <w:shd w:fill="F8FAFC"/>
             <w:tcMar>
-              <w:top w:w="60" w:type="dxa"/>
-              <w:bottom w:w="60" w:type="dxa"/>
-              <w:left w:w="100" w:type="dxa"/>
-              <w:right w:w="100" w:type="dxa"/>
+              <w:top w:w="50" w:type="dxa"/>
+              <w:bottom w:w="50" w:type="dxa"/>
+              <w:left w:w="90" w:type="dxa"/>
+              <w:right w:w="90" w:type="dxa"/>
             </w:tcMar>
           </w:tcPr>
           <w:p>
@@ -651,7 +775,7 @@
               <w:rPr>
                 <w:sz w:val="17"/>
               </w:rPr>
-              <w:t>Anonymous abuse mitigation (100 MB per 12h per /64 IPv6, /24 IPv4)</w:t>
+              <w:t>Anonymous quota protection: 100 MB per 12 hrs per /64 IPv6 or /24 IPv4</w:t>
             </w:r>
           </w:p>
         </w:tc>
@@ -665,9 +789,9 @@
     <w:p>
       <w:pPr>
         <w:keepNext/>
-        <w:spacing w:before="200" w:after="60"/>
+        <w:spacing w:before="160" w:after="60"/>
         <w:pBdr>
-          <w:bottom w:val="single" w:sz="8" w:space="2" w:color="0284C7"/>
+          <w:bottom w:val="single" w:sz="6" w:space="2" w:color="0284C7"/>
         </w:pBdr>
       </w:pPr>
       <w:r>
@@ -676,7 +800,7 @@
           <w:color w:val="0F172A"/>
           <w:sz w:val="24"/>
         </w:rPr>
-        <w:t>3. Cryptographic Verification &amp; Defense Mechanisms</w:t>
+        <w:t>3. Cryptographic Verification &amp; Defensive Controls</w:t>
       </w:r>
     </w:p>
     <w:p>
@@ -695,7 +819,7 @@
         <w:rPr>
           <w:sz w:val="19"/>
         </w:rPr>
-        <w:t>Upon file upload, an immutable SHA-256 reference digest is computed chunk-by-chunk and committed to PostgreSQL. Prior to serving any download, FileGuard dynamically hashes the physical storage block. If an adversary alters even a single bit in storage, the stream is abruptly aborted, returning HTTP 409 Conflict.</w:t>
+        <w:t>During upload, an authoritative SHA-256 reference hash is calculated chunk-by-chunk and committed to PostgreSQL. On download, the server hashes the storage block before streaming bytes to the client. Any 1-bit variance triggers an immediate HTTP 409 Anti-Tamper block, logs a CRITICAL security event, and aborts delivery.</w:t>
       </w:r>
     </w:p>
     <w:p>
@@ -714,7 +838,7 @@
         <w:rPr>
           <w:sz w:val="19"/>
         </w:rPr>
-        <w:t>Public sharing tokens are generated via Python's secrets module (256-bit entropy formatted as XXXX-XXXX). The raw token is delivered exclusively to the uploader and never saved in plaintext; only its SHA-256 digest is indexed, rendering database dumps useless for link enumeration.</w:t>
+        <w:t>Sharing tokens are created via Python's secrets module (256-bit entropy formatted as XXXX-XXXX). The raw token is returned solely to the uploader and never saved in plaintext; only its SHA-256 digest is indexed in PostgreSQL, protecting active links against database disclosure.</w:t>
       </w:r>
     </w:p>
     <w:p>
@@ -733,7 +857,7 @@
         <w:rPr>
           <w:sz w:val="19"/>
         </w:rPr>
-        <w:t>Users can drop nested folder hierarchies directly into the upload zone. FileGuard auto-packages the contents dynamically into a standardized ZIP stream entirely in memory, preserving directory structures without writing unencrypted intermediate files to host storage.</w:t>
+        <w:t>Users can drag-and-drop entire directory trees or multiple files up to 100 MB. FileGuard compresses them on the fly into an organized ZIP archive in memory, preserving folder paths without creating unencrypted temporary files on the host disk.</w:t>
       </w:r>
     </w:p>
     <w:p>
@@ -746,21 +870,21 @@
           <w:b/>
           <w:sz w:val="19"/>
         </w:rPr>
-        <w:t xml:space="preserve">Subnet CIDR Quota Isolation: </w:t>
+        <w:t xml:space="preserve">CIDR Subnet Quota Enforcement: </w:t>
       </w:r>
       <w:r>
         <w:rPr>
           <w:sz w:val="19"/>
         </w:rPr>
-        <w:t>To deter automated denial-of-service without compromising anonymity, incoming client IPs are normalized to /64 CIDR blocks (for IPv6) and /24 blocks (for IPv4). Each subnet is capped at 100 MB per rolling 12-hour window.</w:t>
+        <w:t>To eliminate anonymous quota evasion via IPv6 rotation or dynamic IP reassignment, client IP addresses are normalized to /64 CIDR blocks (for IPv6) and /24 blocks (for IPv4). Each subnet is constrained to 100 MB per rolling 12-hour window.</w:t>
       </w:r>
     </w:p>
     <w:p>
       <w:pPr>
         <w:keepNext/>
-        <w:spacing w:before="200" w:after="60"/>
+        <w:spacing w:before="160" w:after="60"/>
         <w:pBdr>
-          <w:bottom w:val="single" w:sz="8" w:space="2" w:color="0284C7"/>
+          <w:bottom w:val="single" w:sz="6" w:space="2" w:color="0284C7"/>
         </w:pBdr>
       </w:pPr>
       <w:r>
@@ -774,7 +898,7 @@
     </w:p>
     <w:p>
       <w:r>
-        <w:t>FileGuard incorporates a structured Security Information and Event Management (SIEM) module. Operating in the administrative portal, it records five audit tiers (INFO, LOW, MEDIUM, HIGH, CRITICAL) and maps external tampering attempts.</w:t>
+        <w:t>The administrative module provides structured security monitoring and tamper investigation capabilities:</w:t>
       </w:r>
     </w:p>
     <w:p>
@@ -787,13 +911,13 @@
           <w:b/>
           <w:sz w:val="19"/>
         </w:rPr>
-        <w:t xml:space="preserve">Live Bit-Flip Attack Simulator: </w:t>
+        <w:t xml:space="preserve">Interactive Bit-Flip Attack Simulator: </w:t>
       </w:r>
       <w:r>
         <w:rPr>
           <w:sz w:val="19"/>
         </w:rPr>
-        <w:t>An integrated forensic laboratory allows security evaluators to inject controlled 1-byte corruptions directly into Backblaze B2 storage blocks to observe the circuit breaker intercepting the download live.</w:t>
+        <w:t>Enables evaluators to inject controlled 1-byte mutations into stored objects to observe real-time detection, HTTP 409 blocking, and automated forensic alert logging.</w:t>
       </w:r>
     </w:p>
     <w:p>
@@ -806,13 +930,13 @@
           <w:b/>
           <w:sz w:val="19"/>
         </w:rPr>
-        <w:t xml:space="preserve">OS vs. Application Discrepancy Audits: </w:t>
+        <w:t xml:space="preserve">Filesystem Inode &amp; Metadata Auditing: </w:t>
       </w:r>
       <w:r>
         <w:rPr>
           <w:sz w:val="19"/>
         </w:rPr>
-        <w:t>Cross-verifies PostgreSQL catalog timestamps against low-level filesystem inode metadata (stat ctime, mtime, atime) to detect out-of-band administrative tampering.</w:t>
+        <w:t>Cross-references database timestamps with low-level OS stat attributes (ctime, mtime, atime) to uncover unauthorized out-of-band administrative tampering.</w:t>
       </w:r>
     </w:p>
     <w:p>
@@ -825,21 +949,21 @@
           <w:b/>
           <w:sz w:val="19"/>
         </w:rPr>
-        <w:t xml:space="preserve">Forensic Chain-of-Custody Export: </w:t>
+        <w:t xml:space="preserve">SIEM Audit Event Stream: </w:t>
       </w:r>
       <w:r>
         <w:rPr>
           <w:sz w:val="19"/>
         </w:rPr>
-        <w:t>Generates signed JSON audit packages containing complete download attempts, IP headers, and integrity verifications for legal evidence trails.</w:t>
+        <w:t>Records events across five severity tiers (INFO, LOW, MEDIUM, HIGH, CRITICAL) and four outcomes (SUCCESS, BLOCKED, WARNING, FAILURE) with client IP telemetry.</w:t>
       </w:r>
     </w:p>
     <w:p>
       <w:pPr>
         <w:keepNext/>
-        <w:spacing w:before="200" w:after="60"/>
+        <w:spacing w:before="160" w:after="60"/>
         <w:pBdr>
-          <w:bottom w:val="single" w:sz="8" w:space="2" w:color="0284C7"/>
+          <w:bottom w:val="single" w:sz="6" w:space="2" w:color="0284C7"/>
         </w:pBdr>
       </w:pPr>
       <w:r>
@@ -852,8 +976,22 @@
       </w:r>
     </w:p>
     <w:p>
+      <w:pPr>
+        <w:pStyle w:val="ListBullet"/>
+        <w:spacing w:after="40" w:line="276" w:lineRule="auto"/>
+      </w:pPr>
       <w:r>
-        <w:t>Production deployment on Render Web Services communicates with Backblaze B2 Object Storage and Neon Serverless PostgreSQL in the Asia-Pacific (Singapore) region. Multi-threaded transfer optimizations resolve traditional latency overhead:</w:t>
+        <w:rPr>
+          <w:b/>
+          <w:sz w:val="19"/>
+        </w:rPr>
+        <w:t xml:space="preserve">Multi-Threaded S3 Multipart Transfers: </w:t>
+      </w:r>
+      <w:r>
+        <w:rPr>
+          <w:sz w:val="19"/>
+        </w:rPr>
+        <w:t>Configured boto3 TransferConfig with 10 parallel threads and 256 KB memory buffers, drastically reducing latency for large document packages and video files.</w:t>
       </w:r>
     </w:p>
     <w:p>
@@ -866,13 +1004,13 @@
           <w:b/>
           <w:sz w:val="19"/>
         </w:rPr>
-        <w:t xml:space="preserve">10-Thread Parallel S3 Multipart Streaming: </w:t>
+        <w:t xml:space="preserve">10 GB Capacity Monitor &amp; 90% Threshold Alert: </w:t>
       </w:r>
       <w:r>
         <w:rPr>
           <w:sz w:val="19"/>
         </w:rPr>
-        <w:t>Configured boto3.s3.transfer.TransferConfig with 10 concurrent threads and 256 KB memory buffers, reducing transmission latency for high-resolution images, video files, and dense ZIP archives.</w:t>
+        <w:t>Continuously tallies active storage consumption against Backblaze B2 bucket limits, displaying real-time metrics and a 7-day usage trajectory chart.</w:t>
       </w:r>
     </w:p>
     <w:p>
@@ -885,40 +1023,21 @@
           <w:b/>
           <w:sz w:val="19"/>
         </w:rPr>
-        <w:t xml:space="preserve">10 GB Capacity Tracker with 90% Threshold Alert: </w:t>
+        <w:t xml:space="preserve">Automated Conditional Schema Migrations: </w:t>
       </w:r>
       <w:r>
         <w:rPr>
           <w:sz w:val="19"/>
         </w:rPr>
-        <w:t>Real-time capacity gauge continuously tallies active bytes against cloud tier quotas, accompanied by a 7-day dual-axis trajectory graph tracking cumulative data consumption.</w:t>
-      </w:r>
-    </w:p>
-    <w:p>
-      <w:pPr>
-        <w:pStyle w:val="ListBullet"/>
-        <w:spacing w:after="40" w:line="276" w:lineRule="auto"/>
-      </w:pPr>
-      <w:r>
-        <w:rPr>
-          <w:b/>
-          <w:sz w:val="19"/>
-        </w:rPr>
-        <w:t xml:space="preserve">Zero-Downtime Conditional Schema Migrations: </w:t>
-      </w:r>
-      <w:r>
-        <w:rPr>
-          <w:sz w:val="19"/>
-        </w:rPr>
-        <w:t>Embedded dialect-aware DDL scripts inside init_db.py automatically sync missing database columns and indices during Render deployment cycles without data loss.</w:t>
+        <w:t>Embedded DDL migration handlers inside init_db.py dynamically apply schema adjustments during Render build cycles, preventing schema drift on serverless PostgreSQL.</w:t>
       </w:r>
     </w:p>
     <w:p>
       <w:pPr>
         <w:keepNext/>
-        <w:spacing w:before="200" w:after="60"/>
+        <w:spacing w:before="160" w:after="60"/>
         <w:pBdr>
-          <w:bottom w:val="single" w:sz="8" w:space="2" w:color="0284C7"/>
+          <w:bottom w:val="single" w:sz="6" w:space="2" w:color="0284C7"/>
         </w:pBdr>
       </w:pPr>
       <w:r>
@@ -927,12 +1046,7 @@
           <w:color w:val="0F172A"/>
           <w:sz w:val="24"/>
         </w:rPr>
-        <w:t>6. Privacy-First Client Vault &amp; UX Architecture</w:t>
-      </w:r>
-    </w:p>
-    <w:p>
-      <w:r>
-        <w:t>The frontend implements a high-contrast Neo-Brutalist design language constructed entirely in vanilla ES6+ JavaScript and CSS3 custom properties, achieving sub-second first-contentful paint without heavy JavaScript framework overhead.</w:t>
+        <w:t>6. Privacy-First Client Vault &amp; User Experience</w:t>
       </w:r>
     </w:p>
     <w:p>
@@ -951,7 +1065,7 @@
         <w:rPr>
           <w:sz w:val="19"/>
         </w:rPr>
-        <w:t>Stores records of 'Uploaded By Me' and 'Shared With Me (Viewed)' directly on the client's device. No user profiles or personal tracking data are ever transmitted to the server.</w:t>
+        <w:t>Records 'Uploaded By Me' and 'Shared With Me (Viewed)' directly in client-side localStorage. No user accounts, passwords, or personal profiling exist on the server.</w:t>
       </w:r>
     </w:p>
     <w:p>
@@ -964,13 +1078,13 @@
           <w:b/>
           <w:sz w:val="19"/>
         </w:rPr>
-        <w:t xml:space="preserve">Batch Live Status Synchronization (/api/files/batch-status): </w:t>
+        <w:t xml:space="preserve">Live Batch Status Synchronization (/api/files/batch-status): </w:t>
       </w:r>
       <w:r>
         <w:rPr>
           <w:sz w:val="19"/>
         </w:rPr>
-        <w:t>On page load, the history vault transmits up to 50 local tokens in a single JSON payload to query current state, updating live 1-second countdown tickers in real time.</w:t>
+        <w:t>Queries up to 50 local tokens in a single JSON payload to update live status badges (Active, Expired, Revoked) and 1-second countdown tickers.</w:t>
       </w:r>
     </w:p>
     <w:p>
@@ -983,21 +1097,21 @@
           <w:b/>
           <w:sz w:val="19"/>
         </w:rPr>
-        <w:t xml:space="preserve">Instant 1-Click Early Purge: </w:t>
+        <w:t xml:space="preserve">1-Click Early Remote Revocation: </w:t>
       </w:r>
       <w:r>
         <w:rPr>
           <w:sz w:val="19"/>
         </w:rPr>
-        <w:t>Uploaders can immediately revoke and delete their active files from Backblaze B2 ahead of the 12-hour limit, triggering instant cloud deletion.</w:t>
+        <w:t>Uploaders can immediately purge their active files from Backblaze B2 ahead of the 12-hour deadline, instantly invalidating the link.</w:t>
       </w:r>
     </w:p>
     <w:p>
       <w:pPr>
         <w:keepNext/>
-        <w:spacing w:before="200" w:after="60"/>
+        <w:spacing w:before="160" w:after="60"/>
         <w:pBdr>
-          <w:bottom w:val="single" w:sz="8" w:space="2" w:color="0284C7"/>
+          <w:bottom w:val="single" w:sz="6" w:space="2" w:color="0284C7"/>
         </w:pBdr>
       </w:pPr>
       <w:r>
@@ -1006,12 +1120,12 @@
           <w:color w:val="0F172A"/>
           <w:sz w:val="24"/>
         </w:rPr>
-        <w:t>7. Verification, Testing &amp; Empirical Results</w:t>
+        <w:t>7. Verification, Testing &amp; Team Contributions</w:t>
       </w:r>
     </w:p>
     <w:p>
       <w:r>
-        <w:t>The platform undergoes continuous regression verification using an automated Pytest test harness comprising 43 unit, penetration, and integration tests.</w:t>
+        <w:t>FileGuard was validated with an automated Pytest test suite of 43 test cases covering functional, security, and SEO domains (100% pass rate):</w:t>
       </w:r>
     </w:p>
     <w:tbl>
@@ -1021,20 +1135,20 @@
         <w:tblLook w:firstColumn="1" w:firstRow="1" w:lastColumn="0" w:lastRow="0" w:noHBand="0" w:noVBand="1" w:val="04A0"/>
       </w:tblPr>
       <w:tblGrid>
-        <w:gridCol w:w="3408"/>
-        <w:gridCol w:w="3408"/>
-        <w:gridCol w:w="3408"/>
+        <w:gridCol w:w="3360"/>
+        <w:gridCol w:w="3360"/>
+        <w:gridCol w:w="3360"/>
       </w:tblGrid>
       <w:tr>
         <w:tc>
           <w:tcPr>
-            <w:tcW w:type="dxa" w:w="3408"/>
+            <w:tcW w:type="dxa" w:w="3360"/>
             <w:shd w:fill="0F172A"/>
             <w:tcMar>
-              <w:top w:w="60" w:type="dxa"/>
-              <w:bottom w:w="60" w:type="dxa"/>
-              <w:left w:w="100" w:type="dxa"/>
-              <w:right w:w="100" w:type="dxa"/>
+              <w:top w:w="50" w:type="dxa"/>
+              <w:bottom w:w="50" w:type="dxa"/>
+              <w:left w:w="90" w:type="dxa"/>
+              <w:right w:w="90" w:type="dxa"/>
             </w:tcMar>
           </w:tcPr>
           <w:p>
@@ -1053,13 +1167,13 @@
         </w:tc>
         <w:tc>
           <w:tcPr>
-            <w:tcW w:type="dxa" w:w="3408"/>
+            <w:tcW w:type="dxa" w:w="3360"/>
             <w:shd w:fill="0F172A"/>
             <w:tcMar>
-              <w:top w:w="60" w:type="dxa"/>
-              <w:bottom w:w="60" w:type="dxa"/>
-              <w:left w:w="100" w:type="dxa"/>
-              <w:right w:w="100" w:type="dxa"/>
+              <w:top w:w="50" w:type="dxa"/>
+              <w:bottom w:w="50" w:type="dxa"/>
+              <w:left w:w="90" w:type="dxa"/>
+              <w:right w:w="90" w:type="dxa"/>
             </w:tcMar>
           </w:tcPr>
           <w:p>
@@ -1078,13 +1192,13 @@
         </w:tc>
         <w:tc>
           <w:tcPr>
-            <w:tcW w:type="dxa" w:w="3408"/>
+            <w:tcW w:type="dxa" w:w="3360"/>
             <w:shd w:fill="0F172A"/>
             <w:tcMar>
-              <w:top w:w="60" w:type="dxa"/>
-              <w:bottom w:w="60" w:type="dxa"/>
-              <w:left w:w="100" w:type="dxa"/>
-              <w:right w:w="100" w:type="dxa"/>
+              <w:top w:w="50" w:type="dxa"/>
+              <w:bottom w:w="50" w:type="dxa"/>
+              <w:left w:w="90" w:type="dxa"/>
+              <w:right w:w="90" w:type="dxa"/>
             </w:tcMar>
           </w:tcPr>
           <w:p>
@@ -1105,13 +1219,13 @@
       <w:tr>
         <w:tc>
           <w:tcPr>
-            <w:tcW w:type="dxa" w:w="2880"/>
+            <w:tcW w:type="dxa" w:w="2592"/>
             <w:shd w:fill="F8FAFC"/>
             <w:tcMar>
-              <w:top w:w="50" w:type="dxa"/>
-              <w:bottom w:w="50" w:type="dxa"/>
-              <w:left w:w="100" w:type="dxa"/>
-              <w:right w:w="100" w:type="dxa"/>
+              <w:top w:w="40" w:type="dxa"/>
+              <w:bottom w:w="40" w:type="dxa"/>
+              <w:left w:w="90" w:type="dxa"/>
+              <w:right w:w="90" w:type="dxa"/>
             </w:tcMar>
           </w:tcPr>
           <w:p>
@@ -1131,10 +1245,10 @@
             <w:tcW w:type="dxa" w:w="3888"/>
             <w:shd w:fill="F8FAFC"/>
             <w:tcMar>
-              <w:top w:w="50" w:type="dxa"/>
-              <w:bottom w:w="50" w:type="dxa"/>
-              <w:left w:w="100" w:type="dxa"/>
-              <w:right w:w="100" w:type="dxa"/>
+              <w:top w:w="40" w:type="dxa"/>
+              <w:bottom w:w="40" w:type="dxa"/>
+              <w:left w:w="90" w:type="dxa"/>
+              <w:right w:w="90" w:type="dxa"/>
             </w:tcMar>
           </w:tcPr>
           <w:p>
@@ -1151,13 +1265,13 @@
         </w:tc>
         <w:tc>
           <w:tcPr>
-            <w:tcW w:type="dxa" w:w="3456"/>
+            <w:tcW w:type="dxa" w:w="3600"/>
             <w:shd w:fill="F8FAFC"/>
             <w:tcMar>
-              <w:top w:w="50" w:type="dxa"/>
-              <w:bottom w:w="50" w:type="dxa"/>
-              <w:left w:w="100" w:type="dxa"/>
-              <w:right w:w="100" w:type="dxa"/>
+              <w:top w:w="40" w:type="dxa"/>
+              <w:bottom w:w="40" w:type="dxa"/>
+              <w:left w:w="90" w:type="dxa"/>
+              <w:right w:w="90" w:type="dxa"/>
             </w:tcMar>
           </w:tcPr>
           <w:p>
@@ -1176,13 +1290,13 @@
       <w:tr>
         <w:tc>
           <w:tcPr>
-            <w:tcW w:type="dxa" w:w="2880"/>
+            <w:tcW w:type="dxa" w:w="2592"/>
             <w:shd w:fill="FFFFFF"/>
             <w:tcMar>
-              <w:top w:w="50" w:type="dxa"/>
-              <w:bottom w:w="50" w:type="dxa"/>
-              <w:left w:w="100" w:type="dxa"/>
-              <w:right w:w="100" w:type="dxa"/>
+              <w:top w:w="40" w:type="dxa"/>
+              <w:bottom w:w="40" w:type="dxa"/>
+              <w:left w:w="90" w:type="dxa"/>
+              <w:right w:w="90" w:type="dxa"/>
             </w:tcMar>
           </w:tcPr>
           <w:p>
@@ -1202,10 +1316,10 @@
             <w:tcW w:type="dxa" w:w="3888"/>
             <w:shd w:fill="FFFFFF"/>
             <w:tcMar>
-              <w:top w:w="50" w:type="dxa"/>
-              <w:bottom w:w="50" w:type="dxa"/>
-              <w:left w:w="100" w:type="dxa"/>
-              <w:right w:w="100" w:type="dxa"/>
+              <w:top w:w="40" w:type="dxa"/>
+              <w:bottom w:w="40" w:type="dxa"/>
+              <w:left w:w="90" w:type="dxa"/>
+              <w:right w:w="90" w:type="dxa"/>
             </w:tcMar>
           </w:tcPr>
           <w:p>
@@ -1222,13 +1336,13 @@
         </w:tc>
         <w:tc>
           <w:tcPr>
-            <w:tcW w:type="dxa" w:w="3456"/>
+            <w:tcW w:type="dxa" w:w="3600"/>
             <w:shd w:fill="FFFFFF"/>
             <w:tcMar>
-              <w:top w:w="50" w:type="dxa"/>
-              <w:bottom w:w="50" w:type="dxa"/>
-              <w:left w:w="100" w:type="dxa"/>
-              <w:right w:w="100" w:type="dxa"/>
+              <w:top w:w="40" w:type="dxa"/>
+              <w:bottom w:w="40" w:type="dxa"/>
+              <w:left w:w="90" w:type="dxa"/>
+              <w:right w:w="90" w:type="dxa"/>
             </w:tcMar>
           </w:tcPr>
           <w:p>
@@ -1247,13 +1361,13 @@
       <w:tr>
         <w:tc>
           <w:tcPr>
-            <w:tcW w:type="dxa" w:w="2880"/>
+            <w:tcW w:type="dxa" w:w="2592"/>
             <w:shd w:fill="F8FAFC"/>
             <w:tcMar>
-              <w:top w:w="50" w:type="dxa"/>
-              <w:bottom w:w="50" w:type="dxa"/>
-              <w:left w:w="100" w:type="dxa"/>
-              <w:right w:w="100" w:type="dxa"/>
+              <w:top w:w="40" w:type="dxa"/>
+              <w:bottom w:w="40" w:type="dxa"/>
+              <w:left w:w="90" w:type="dxa"/>
+              <w:right w:w="90" w:type="dxa"/>
             </w:tcMar>
           </w:tcPr>
           <w:p>
@@ -1273,10 +1387,10 @@
             <w:tcW w:type="dxa" w:w="3888"/>
             <w:shd w:fill="F8FAFC"/>
             <w:tcMar>
-              <w:top w:w="50" w:type="dxa"/>
-              <w:bottom w:w="50" w:type="dxa"/>
-              <w:left w:w="100" w:type="dxa"/>
-              <w:right w:w="100" w:type="dxa"/>
+              <w:top w:w="40" w:type="dxa"/>
+              <w:bottom w:w="40" w:type="dxa"/>
+              <w:left w:w="90" w:type="dxa"/>
+              <w:right w:w="90" w:type="dxa"/>
             </w:tcMar>
           </w:tcPr>
           <w:p>
@@ -1293,13 +1407,13 @@
         </w:tc>
         <w:tc>
           <w:tcPr>
-            <w:tcW w:type="dxa" w:w="3456"/>
+            <w:tcW w:type="dxa" w:w="3600"/>
             <w:shd w:fill="F8FAFC"/>
             <w:tcMar>
-              <w:top w:w="50" w:type="dxa"/>
-              <w:bottom w:w="50" w:type="dxa"/>
-              <w:left w:w="100" w:type="dxa"/>
-              <w:right w:w="100" w:type="dxa"/>
+              <w:top w:w="40" w:type="dxa"/>
+              <w:bottom w:w="40" w:type="dxa"/>
+              <w:left w:w="90" w:type="dxa"/>
+              <w:right w:w="90" w:type="dxa"/>
             </w:tcMar>
           </w:tcPr>
           <w:p>
@@ -1318,13 +1432,13 @@
       <w:tr>
         <w:tc>
           <w:tcPr>
-            <w:tcW w:type="dxa" w:w="2880"/>
+            <w:tcW w:type="dxa" w:w="2592"/>
             <w:shd w:fill="FFFFFF"/>
             <w:tcMar>
-              <w:top w:w="50" w:type="dxa"/>
-              <w:bottom w:w="50" w:type="dxa"/>
-              <w:left w:w="100" w:type="dxa"/>
-              <w:right w:w="100" w:type="dxa"/>
+              <w:top w:w="40" w:type="dxa"/>
+              <w:bottom w:w="40" w:type="dxa"/>
+              <w:left w:w="90" w:type="dxa"/>
+              <w:right w:w="90" w:type="dxa"/>
             </w:tcMar>
           </w:tcPr>
           <w:p>
@@ -1344,10 +1458,10 @@
             <w:tcW w:type="dxa" w:w="3888"/>
             <w:shd w:fill="FFFFFF"/>
             <w:tcMar>
-              <w:top w:w="50" w:type="dxa"/>
-              <w:bottom w:w="50" w:type="dxa"/>
-              <w:left w:w="100" w:type="dxa"/>
-              <w:right w:w="100" w:type="dxa"/>
+              <w:top w:w="40" w:type="dxa"/>
+              <w:bottom w:w="40" w:type="dxa"/>
+              <w:left w:w="90" w:type="dxa"/>
+              <w:right w:w="90" w:type="dxa"/>
             </w:tcMar>
           </w:tcPr>
           <w:p>
@@ -1364,13 +1478,13 @@
         </w:tc>
         <w:tc>
           <w:tcPr>
-            <w:tcW w:type="dxa" w:w="3456"/>
+            <w:tcW w:type="dxa" w:w="3600"/>
             <w:shd w:fill="FFFFFF"/>
             <w:tcMar>
-              <w:top w:w="50" w:type="dxa"/>
-              <w:bottom w:w="50" w:type="dxa"/>
-              <w:left w:w="100" w:type="dxa"/>
-              <w:right w:w="100" w:type="dxa"/>
+              <w:top w:w="40" w:type="dxa"/>
+              <w:bottom w:w="40" w:type="dxa"/>
+              <w:left w:w="90" w:type="dxa"/>
+              <w:right w:w="90" w:type="dxa"/>
             </w:tcMar>
           </w:tcPr>
           <w:p>
@@ -1395,9 +1509,61 @@
     <w:p>
       <w:pPr>
         <w:keepNext/>
-        <w:spacing w:before="200" w:after="60"/>
+        <w:spacing w:before="160" w:after="60"/>
+      </w:pPr>
+      <w:r>
+        <w:rPr>
+          <w:b/>
+          <w:color w:val="0284C7"/>
+          <w:sz w:val="21"/>
+        </w:rPr>
+        <w:t>Team Member Contributions (Listed Alphabetically)</w:t>
+      </w:r>
+    </w:p>
+    <w:p>
+      <w:pPr>
+        <w:pStyle w:val="ListBullet"/>
+        <w:spacing w:after="40" w:line="276" w:lineRule="auto"/>
+      </w:pPr>
+      <w:r>
+        <w:rPr>
+          <w:b/>
+          <w:sz w:val="19"/>
+        </w:rPr>
+        <w:t xml:space="preserve">Aaditya Abhijit (Student ID: 245811404): </w:t>
+      </w:r>
+      <w:r>
+        <w:rPr>
+          <w:sz w:val="19"/>
+        </w:rPr>
+        <w:t>Engineered the SHA-256 cryptographic pre-flight verification pipeline; built the OS filesystem inode metadata auditing module; created the interactive bit-flip tampering simulator; designed the structured SIEM security event logger; developed automated test suites for file tampering and missing file detection.</w:t>
+      </w:r>
+    </w:p>
+    <w:p>
+      <w:pPr>
+        <w:pStyle w:val="ListBullet"/>
+        <w:spacing w:after="40" w:line="276" w:lineRule="auto"/>
+      </w:pPr>
+      <w:r>
+        <w:rPr>
+          <w:b/>
+          <w:sz w:val="19"/>
+        </w:rPr>
+        <w:t xml:space="preserve">Deeptanil Sinha (Student ID: 245811402): </w:t>
+      </w:r>
+      <w:r>
+        <w:rPr>
+          <w:sz w:val="19"/>
+        </w:rPr>
+        <w:t>Designed the end-to-end full-stack architecture and Neo-Brutalist UI; engineered the in-memory streaming ZIP packager for folder uploads; implemented CIDR-normalized subnet quota controls; integrated Neon Serverless PostgreSQL and Backblaze B2 S3 multipart transfers; developed the client-side localStorage vault with batch status synchronization.</w:t>
+      </w:r>
+    </w:p>
+    <w:p>
+      <w:pPr>
+        <w:keepNext/>
+        <w:spacing w:before="160" w:after="60"/>
         <w:pBdr>
-          <w:bottom w:val="single" w:sz="8" w:space="2" w:color="0284C7"/>
+          <w:bottom w:val="single" w:sz="6" w:space="2" w:color="0284C7"/>
         </w:pBdr>
       </w:pPr>
       <w:r>
@@ -1406,12 +1572,12 @@
           <w:color w:val="0F172A"/>
           <w:sz w:val="24"/>
         </w:rPr>
-        <w:t>8. Conclusion &amp; Project Deliverables</w:t>
+        <w:t>8. Conclusion &amp; Academic Verification</w:t>
       </w:r>
     </w:p>
     <w:p>
       <w:r>
-        <w:t>FileGuard demonstrates that temporary file sharing does not require compromising user privacy or accepting data corruption risks. By uniting strict 12-hour self-destruct routines, in-memory folder compression, SHA-256 pre-flight circuit breakers, and client-side vault architectures, the project establishes a production-hardened standard for zero-knowledge ephemeral computing.</w:t>
+        <w:t>FileGuard demonstrates that temporary file sharing can achieve enterprise-grade security without sacrificing user convenience or privacy. By coupling strict 12-hour self-destruct routines, in-memory folder compression, pre-flight cryptographic validation, and zero-knowledge client vaults, FileGuard provides a robust reference implementation for Information &amp; Network Security.</w:t>
       </w:r>
     </w:p>
     <w:tbl>
@@ -1421,18 +1587,18 @@
         <w:tblLook w:firstColumn="1" w:firstRow="1" w:lastColumn="0" w:lastRow="0" w:noHBand="0" w:noVBand="1" w:val="04A0"/>
       </w:tblPr>
       <w:tblGrid>
-        <w:gridCol w:w="10224"/>
+        <w:gridCol w:w="10080"/>
       </w:tblGrid>
       <w:tr>
         <w:tc>
           <w:tcPr>
-            <w:tcW w:type="dxa" w:w="10224"/>
+            <w:tcW w:type="dxa" w:w="10080"/>
             <w:shd w:fill="F1F5F9"/>
             <w:tcMar>
-              <w:top w:w="80" w:type="dxa"/>
-              <w:bottom w:w="80" w:type="dxa"/>
-              <w:left w:w="120" w:type="dxa"/>
-              <w:right w:w="120" w:type="dxa"/>
+              <w:top w:w="60" w:type="dxa"/>
+              <w:bottom w:w="60" w:type="dxa"/>
+              <w:left w:w="100" w:type="dxa"/>
+              <w:right w:w="100" w:type="dxa"/>
             </w:tcMar>
           </w:tcPr>
           <w:p>
@@ -1442,15 +1608,15 @@
             <w:r>
               <w:rPr>
                 <w:b/>
-                <w:sz w:val="18"/>
+                <w:sz w:val="17"/>
               </w:rPr>
-              <w:t xml:space="preserve">Project Verification Links: </w:t>
+              <w:t xml:space="preserve">Academic Verification Deliverables: </w:t>
             </w:r>
             <w:r>
               <w:rPr>
-                <w:sz w:val="18"/>
+                <w:sz w:val="17"/>
               </w:rPr>
-              <w:t>Live Deployment: https://files.deeptanil.in  |  GitHub Repository: https://github.com/Deeptanil/FileGuard.git  |  AI Manifest: https://files.deeptanil.in/llms.txt</w:t>
+              <w:t>Production URL: https://files.deeptanil.in  |  Repository: https://github.com/Deeptanil/FileGuard.git  |  AI Manifest: https://files.deeptanil.in/llms.txt</w:t>
             </w:r>
           </w:p>
         </w:tc>
@@ -1458,7 +1624,7 @@
     </w:tbl>
     <w:sectPr>
       <w:pgSz w:w="12240" w:h="15840"/>
-      <w:pgMar w:top="936" w:right="1008" w:bottom="936" w:left="1008" w:header="720" w:footer="720" w:gutter="0"/>
+      <w:pgMar w:top="1008" w:right="1080" w:bottom="1008" w:left="1080" w:header="720" w:footer="720" w:gutter="0"/>
       <w:cols w:space="720"/>
       <w:docGrid w:linePitch="360"/>
     </w:sectPr>
@@ -1834,8 +2000,8 @@
     </w:pPr>
     <w:rPr>
       <w:rFonts w:ascii="Calibri" w:hAnsi="Calibri"/>
-      <w:color w:val="1E293B"/>
-      <w:sz w:val="20"/>
+      <w:color w:val="0F172A"/>
+      <w:sz w:val="21"/>
     </w:rPr>
   </w:style>
   <w:style w:type="paragraph" w:styleId="Header">

</xml_diff>

<commit_message>
feat: update button styles for improved UI consistency and accessibility; increment stylesheet version
</commit_message>
<xml_diff>
--- a/FileGuard_Project_Report.docx
+++ b/FileGuard_Project_Report.docx
@@ -9,7 +9,7 @@
       <w:r>
         <w:rPr>
           <w:b/>
-          <w:color w:val="0F172A"/>
+          <w:color w:val="000000"/>
           <w:sz w:val="32"/>
         </w:rPr>
         <w:t>FILEGUARD: SECURE EPHEMERAL FILE SHARING SYSTEM</w:t>
@@ -22,7 +22,7 @@
       <w:r>
         <w:rPr>
           <w:b/>
-          <w:color w:val="0284C7"/>
+          <w:color w:val="000000"/>
           <w:sz w:val="22"/>
         </w:rPr>
         <w:t>Cryptographic Integrity Monitoring, Digital Forensics &amp; Ephemeral Cloud Architecture</w:t>
@@ -297,14 +297,11 @@
       <w:pPr>
         <w:keepNext/>
         <w:spacing w:before="160" w:after="60"/>
-        <w:pBdr>
-          <w:bottom w:val="single" w:sz="6" w:space="2" w:color="0284C7"/>
-        </w:pBdr>
       </w:pPr>
       <w:r>
         <w:rPr>
           <w:b/>
-          <w:color w:val="0F172A"/>
+          <w:color w:val="000000"/>
           <w:sz w:val="24"/>
         </w:rPr>
         <w:t>1. Abstract &amp; Problem Statement</w:t>
@@ -319,14 +316,11 @@
       <w:pPr>
         <w:keepNext/>
         <w:spacing w:before="160" w:after="60"/>
-        <w:pBdr>
-          <w:bottom w:val="single" w:sz="6" w:space="2" w:color="0284C7"/>
-        </w:pBdr>
       </w:pPr>
       <w:r>
         <w:rPr>
           <w:b/>
-          <w:color w:val="0F172A"/>
+          <w:color w:val="000000"/>
           <w:sz w:val="24"/>
         </w:rPr>
         <w:t>2. Architectural Overview &amp; Subsystem Specifications</w:t>
@@ -790,14 +784,11 @@
       <w:pPr>
         <w:keepNext/>
         <w:spacing w:before="160" w:after="60"/>
-        <w:pBdr>
-          <w:bottom w:val="single" w:sz="6" w:space="2" w:color="0284C7"/>
-        </w:pBdr>
       </w:pPr>
       <w:r>
         <w:rPr>
           <w:b/>
-          <w:color w:val="0F172A"/>
+          <w:color w:val="000000"/>
           <w:sz w:val="24"/>
         </w:rPr>
         <w:t>3. Cryptographic Verification &amp; Defensive Controls</w:t>
@@ -883,14 +874,11 @@
       <w:pPr>
         <w:keepNext/>
         <w:spacing w:before="160" w:after="60"/>
-        <w:pBdr>
-          <w:bottom w:val="single" w:sz="6" w:space="2" w:color="0284C7"/>
-        </w:pBdr>
       </w:pPr>
       <w:r>
         <w:rPr>
           <w:b/>
-          <w:color w:val="0F172A"/>
+          <w:color w:val="000000"/>
           <w:sz w:val="24"/>
         </w:rPr>
         <w:t>4. Digital Forensics &amp; Audit Telemetry</w:t>
@@ -962,14 +950,11 @@
       <w:pPr>
         <w:keepNext/>
         <w:spacing w:before="160" w:after="60"/>
-        <w:pBdr>
-          <w:bottom w:val="single" w:sz="6" w:space="2" w:color="0284C7"/>
-        </w:pBdr>
       </w:pPr>
       <w:r>
         <w:rPr>
           <w:b/>
-          <w:color w:val="0F172A"/>
+          <w:color w:val="000000"/>
           <w:sz w:val="24"/>
         </w:rPr>
         <w:t>5. Cloud Infrastructure &amp; Storage Engineering</w:t>
@@ -1036,14 +1021,11 @@
       <w:pPr>
         <w:keepNext/>
         <w:spacing w:before="160" w:after="60"/>
-        <w:pBdr>
-          <w:bottom w:val="single" w:sz="6" w:space="2" w:color="0284C7"/>
-        </w:pBdr>
       </w:pPr>
       <w:r>
         <w:rPr>
           <w:b/>
-          <w:color w:val="0F172A"/>
+          <w:color w:val="000000"/>
           <w:sz w:val="24"/>
         </w:rPr>
         <w:t>6. Privacy-First Client Vault &amp; User Experience</w:t>
@@ -1110,14 +1092,11 @@
       <w:pPr>
         <w:keepNext/>
         <w:spacing w:before="160" w:after="60"/>
-        <w:pBdr>
-          <w:bottom w:val="single" w:sz="6" w:space="2" w:color="0284C7"/>
-        </w:pBdr>
       </w:pPr>
       <w:r>
         <w:rPr>
           <w:b/>
-          <w:color w:val="0F172A"/>
+          <w:color w:val="000000"/>
           <w:sz w:val="24"/>
         </w:rPr>
         <w:t>7. Verification, Testing &amp; Team Contributions</w:t>
@@ -1514,7 +1493,7 @@
       <w:r>
         <w:rPr>
           <w:b/>
-          <w:color w:val="0284C7"/>
+          <w:color w:val="000000"/>
           <w:sz w:val="21"/>
         </w:rPr>
         <w:t>Team Member Contributions (Listed Alphabetically)</w:t>
@@ -1562,14 +1541,11 @@
       <w:pPr>
         <w:keepNext/>
         <w:spacing w:before="160" w:after="60"/>
-        <w:pBdr>
-          <w:bottom w:val="single" w:sz="6" w:space="2" w:color="0284C7"/>
-        </w:pBdr>
       </w:pPr>
       <w:r>
         <w:rPr>
           <w:b/>
-          <w:color w:val="0F172A"/>
+          <w:color w:val="000000"/>
           <w:sz w:val="24"/>
         </w:rPr>
         <w:t>8. Conclusion &amp; Academic Verification</w:t>
@@ -2000,7 +1976,7 @@
     </w:pPr>
     <w:rPr>
       <w:rFonts w:ascii="Calibri" w:hAnsi="Calibri"/>
-      <w:color w:val="0F172A"/>
+      <w:color w:val="000000"/>
       <w:sz w:val="21"/>
     </w:rPr>
   </w:style>

</xml_diff>

<commit_message>
Refactor upload page routing and update links to anchor sections
- Changed the upload page route to redirect to the home page with an anchor for the upload section.
- Updated all references to the upload page in templates and JavaScript to point to the new anchor link.
- Enhanced the user experience by ensuring consistent navigation to the upload section across various pages.
- Improved the report generation script by updating the document formatting and content, ensuring adherence to academic standards.
</commit_message>
<xml_diff>
--- a/FileGuard_Project_Report.docx
+++ b/FileGuard_Project_Report.docx
@@ -322,7 +322,7 @@
         <w:jc w:val="center"/>
       </w:pPr>
       <w:r>
-        <w:t>Aditiya Abhijit (245811404) &amp; Deeptanil Sinha (245811402)</w:t>
+        <w:t>Aditya Abhijit (245811404) &amp; Deeptanil Sinha (245811402)</w:t>
       </w:r>
     </w:p>
     <w:p>
@@ -339,6 +339,7 @@
       <w:pPr>
         <w:keepNext/>
         <w:spacing w:before="280" w:after="80" w:line="276" w:lineRule="auto"/>
+        <w:jc w:val="left"/>
       </w:pPr>
       <w:r>
         <w:rPr>
@@ -347,27 +348,28 @@
           <w:color w:val="000000"/>
           <w:sz w:val="28"/>
         </w:rPr>
-        <w:lastRenderedPageBreak/>
         <w:t>1. Abstract &amp; Problem Statement</w:t>
       </w:r>
     </w:p>
     <w:p>
       <w:pPr>
-        <w:spacing w:after="120" w:line="360" w:lineRule="auto"/>
+        <w:spacing w:after="120" w:line="360" w:lineRule="auto" w:before="0"/>
         <w:jc w:val="both"/>
       </w:pPr>
       <w:r>
         <w:rPr>
           <w:rFonts w:ascii="Times New Roman" w:hAnsi="Times New Roman"/>
           <w:color w:val="000000"/>
-        </w:rPr>
-        <w:t>Temporary file transmission across open networks presents critical security vulnerabilities: persistent data exposure on remote servers, silent data corruption (bit-rot or malicious in-flight modification), unauthorized token enumeration, and intrusive user tracking. FileGuard is an academic and production-engineered web platform providing zero-knowledge temporary file sharing. It implements a strict 12-hour self-destruct lifecycle, pre-flight SHA-256 cryptographic verification, in-memory folder ZIP bundling, CIDR-masked subnet quota controls, and a digital forensics inspection lab.</w:t>
+          <w:sz w:val="24"/>
+        </w:rPr>
+        <w:t>Temporary file transmission across open networks presents critical security vulnerabilities: persistent data exposure on remote servers, silent data corruption (bit-rot or malicious in-flight modification), unauthorized token enumeration, and intrusive user tracking. FileGuard is an academic and production-oriented web platform providing privacy-focused temporary file sharing. It implements transparent AES-256-GCM encryption at rest, strict 12-hour automated lifecycle purging, pre-flight SHA-256 cryptographic verification, in-memory folder ZIP bundling, client-IP upload quota controls, and an administrative digital forensics inspection lab.</w:t>
       </w:r>
     </w:p>
     <w:p>
       <w:pPr>
         <w:keepNext/>
         <w:spacing w:before="280" w:after="80" w:line="276" w:lineRule="auto"/>
+        <w:jc w:val="left"/>
       </w:pPr>
       <w:r>
         <w:rPr>
@@ -381,13 +383,14 @@
     </w:p>
     <w:p>
       <w:pPr>
-        <w:spacing w:after="120" w:line="360" w:lineRule="auto"/>
+        <w:spacing w:after="120" w:line="360" w:lineRule="auto" w:before="0"/>
         <w:jc w:val="both"/>
       </w:pPr>
       <w:r>
         <w:rPr>
           <w:rFonts w:ascii="Times New Roman" w:hAnsi="Times New Roman"/>
           <w:color w:val="000000"/>
+          <w:sz w:val="24"/>
         </w:rPr>
         <w:t>The system coordinates web routing, object storage, and relational state without disk bottlenecks or unencrypted staging leaks:</w:t>
       </w:r>
@@ -503,7 +506,7 @@
           </w:tcPr>
           <w:p>
             <w:pPr>
-              <w:spacing w:after="40" w:line="276" w:lineRule="auto"/>
+              <w:spacing w:line="276" w:lineRule="auto" w:after="40"/>
             </w:pPr>
             <w:r>
               <w:rPr>
@@ -528,7 +531,7 @@
           </w:tcPr>
           <w:p>
             <w:pPr>
-              <w:spacing w:after="40" w:line="276" w:lineRule="auto"/>
+              <w:spacing w:line="276" w:lineRule="auto" w:after="40"/>
             </w:pPr>
             <w:r>
               <w:rPr>
@@ -553,7 +556,7 @@
           </w:tcPr>
           <w:p>
             <w:pPr>
-              <w:spacing w:after="40" w:line="276" w:lineRule="auto"/>
+              <w:spacing w:line="276" w:lineRule="auto" w:after="40"/>
             </w:pPr>
             <w:r>
               <w:rPr>
@@ -561,7 +564,7 @@
                 <w:color w:val="000000"/>
                 <w:sz w:val="20"/>
               </w:rPr>
-              <w:t>Enforces CSPRNG tokenization, CSRF tokens, nosniff headers</w:t>
+              <w:t>Enforces CSPRNG tokenization, CSRF protection, nosniff &amp; CSP defensive headers</w:t>
             </w:r>
           </w:p>
         </w:tc>
@@ -583,7 +586,7 @@
           </w:tcPr>
           <w:p>
             <w:pPr>
-              <w:spacing w:after="40" w:line="276" w:lineRule="auto"/>
+              <w:spacing w:line="276" w:lineRule="auto" w:after="40"/>
             </w:pPr>
             <w:r>
               <w:rPr>
@@ -608,7 +611,7 @@
           </w:tcPr>
           <w:p>
             <w:pPr>
-              <w:spacing w:after="40" w:line="276" w:lineRule="auto"/>
+              <w:spacing w:line="276" w:lineRule="auto" w:after="40"/>
             </w:pPr>
             <w:r>
               <w:rPr>
@@ -633,7 +636,7 @@
           </w:tcPr>
           <w:p>
             <w:pPr>
-              <w:spacing w:after="40" w:line="276" w:lineRule="auto"/>
+              <w:spacing w:line="276" w:lineRule="auto" w:after="40"/>
             </w:pPr>
             <w:r>
               <w:rPr>
@@ -641,7 +644,7 @@
                 <w:color w:val="000000"/>
                 <w:sz w:val="20"/>
               </w:rPr>
-              <w:t>Stores SHA-256 token hashes, storage UUIDs, expiration timestamps</w:t>
+              <w:t>Stores SHA-256 token digests, storage UUIDs, password hashes, and expiration timestamps</w:t>
             </w:r>
           </w:p>
         </w:tc>
@@ -663,7 +666,7 @@
           </w:tcPr>
           <w:p>
             <w:pPr>
-              <w:spacing w:after="40" w:line="276" w:lineRule="auto"/>
+              <w:spacing w:line="276" w:lineRule="auto" w:after="40"/>
             </w:pPr>
             <w:r>
               <w:rPr>
@@ -688,7 +691,7 @@
           </w:tcPr>
           <w:p>
             <w:pPr>
-              <w:spacing w:after="40" w:line="276" w:lineRule="auto"/>
+              <w:spacing w:line="276" w:lineRule="auto" w:after="40"/>
             </w:pPr>
             <w:r>
               <w:rPr>
@@ -713,7 +716,7 @@
           </w:tcPr>
           <w:p>
             <w:pPr>
-              <w:spacing w:after="40" w:line="276" w:lineRule="auto"/>
+              <w:spacing w:line="276" w:lineRule="auto" w:after="40"/>
             </w:pPr>
             <w:r>
               <w:rPr>
@@ -721,7 +724,7 @@
                 <w:color w:val="000000"/>
                 <w:sz w:val="20"/>
               </w:rPr>
-              <w:t>Multi-threaded multipart streaming (10 threads, 256 KB memory buffer)</w:t>
+              <w:t>Multi-threaded multipart streaming (10 threads, 256 KB memory buffer) with transparent AES-256-GCM encryption at rest</w:t>
             </w:r>
           </w:p>
         </w:tc>
@@ -743,7 +746,7 @@
           </w:tcPr>
           <w:p>
             <w:pPr>
-              <w:spacing w:after="40" w:line="276" w:lineRule="auto"/>
+              <w:spacing w:line="276" w:lineRule="auto" w:after="40"/>
             </w:pPr>
             <w:r>
               <w:rPr>
@@ -768,7 +771,7 @@
           </w:tcPr>
           <w:p>
             <w:pPr>
-              <w:spacing w:after="40" w:line="276" w:lineRule="auto"/>
+              <w:spacing w:line="276" w:lineRule="auto" w:after="40"/>
             </w:pPr>
             <w:r>
               <w:rPr>
@@ -793,7 +796,7 @@
           </w:tcPr>
           <w:p>
             <w:pPr>
-              <w:spacing w:after="40" w:line="276" w:lineRule="auto"/>
+              <w:spacing w:line="276" w:lineRule="auto" w:after="40"/>
             </w:pPr>
             <w:r>
               <w:rPr>
@@ -801,7 +804,7 @@
                 <w:color w:val="000000"/>
                 <w:sz w:val="20"/>
               </w:rPr>
-              <w:t>Dynamic byte-level hash verification halting altered downloads (HTTP 409)</w:t>
+              <w:t>Dynamic byte-level hash verification halting altered downloads before delivery (HTTP 409)</w:t>
             </w:r>
           </w:p>
         </w:tc>
@@ -823,7 +826,7 @@
           </w:tcPr>
           <w:p>
             <w:pPr>
-              <w:spacing w:after="40" w:line="276" w:lineRule="auto"/>
+              <w:spacing w:line="276" w:lineRule="auto" w:after="40"/>
             </w:pPr>
             <w:r>
               <w:rPr>
@@ -848,7 +851,7 @@
           </w:tcPr>
           <w:p>
             <w:pPr>
-              <w:spacing w:after="40" w:line="276" w:lineRule="auto"/>
+              <w:spacing w:line="276" w:lineRule="auto" w:after="40"/>
             </w:pPr>
             <w:r>
               <w:rPr>
@@ -856,7 +859,7 @@
                 <w:color w:val="000000"/>
                 <w:sz w:val="20"/>
               </w:rPr>
-              <w:t>Flask-Limiter / Subnet Masking</w:t>
+              <w:t>Flask-Limiter / Client-IP Quota</w:t>
             </w:r>
           </w:p>
         </w:tc>
@@ -873,7 +876,7 @@
           </w:tcPr>
           <w:p>
             <w:pPr>
-              <w:spacing w:after="40" w:line="276" w:lineRule="auto"/>
+              <w:spacing w:line="276" w:lineRule="auto" w:after="40"/>
             </w:pPr>
             <w:r>
               <w:rPr>
@@ -881,7 +884,7 @@
                 <w:color w:val="000000"/>
                 <w:sz w:val="20"/>
               </w:rPr>
-              <w:t>Anonymous quota protection: 100 MB per 12 hrs per /64 IPv6 or /24 IPv4</w:t>
+              <w:t>Strict rate limiting and 100 MB per rolling 12-hour quota allowance per client device (HTTP 429)</w:t>
             </w:r>
           </w:p>
         </w:tc>
@@ -889,13 +892,14 @@
     </w:tbl>
     <w:p>
       <w:pPr>
-        <w:spacing w:after="40"/>
+        <w:spacing w:after="40" w:before="0"/>
       </w:pPr>
     </w:p>
     <w:p>
       <w:pPr>
         <w:keepNext/>
         <w:spacing w:before="280" w:after="80" w:line="276" w:lineRule="auto"/>
+        <w:jc w:val="left"/>
       </w:pPr>
       <w:r>
         <w:rPr>
@@ -913,13 +917,21 @@
         <w:tabs>
           <w:tab w:val="num" w:pos="360"/>
         </w:tabs>
-        <w:spacing w:before="40" w:line="360" w:lineRule="auto"/>
+        <w:spacing w:before="40" w:line="360" w:lineRule="auto" w:after="80"/>
         <w:ind w:left="360" w:hanging="360"/>
       </w:pPr>
       <w:r>
         <w:rPr>
           <w:rFonts w:ascii="Times New Roman" w:hAnsi="Times New Roman"/>
+          <w:color w:val="000000"/>
+          <w:sz w:val="24"/>
+        </w:rPr>
+      </w:r>
+      <w:r>
+        <w:rPr>
+          <w:rFonts w:ascii="Times New Roman" w:hAnsi="Times New Roman"/>
           <w:b/>
+          <w:color w:val="000000"/>
           <w:sz w:val="24"/>
         </w:rPr>
         <w:t xml:space="preserve">Pre-Flight SHA-256 Anti-Tamper Gate: </w:t>
@@ -927,6 +939,7 @@
       <w:r>
         <w:rPr>
           <w:rFonts w:ascii="Times New Roman" w:hAnsi="Times New Roman"/>
+          <w:color w:val="000000"/>
           <w:sz w:val="24"/>
         </w:rPr>
         <w:t>During upload, an authoritative SHA-256 reference hash is calculated chunk-by-chunk and committed to PostgreSQL. On download, the server hashes the storage block before streaming bytes to the client. Any 1-bit variance triggers an immediate HTTP 409 Anti-Tamper block, logs a CRITICAL security event, and aborts delivery.</w:t>
@@ -938,13 +951,21 @@
         <w:tabs>
           <w:tab w:val="num" w:pos="360"/>
         </w:tabs>
-        <w:spacing w:before="40" w:line="360" w:lineRule="auto"/>
+        <w:spacing w:before="40" w:line="360" w:lineRule="auto" w:after="80"/>
         <w:ind w:left="360" w:hanging="360"/>
       </w:pPr>
       <w:r>
         <w:rPr>
           <w:rFonts w:ascii="Times New Roman" w:hAnsi="Times New Roman"/>
+          <w:color w:val="000000"/>
+          <w:sz w:val="24"/>
+        </w:rPr>
+      </w:r>
+      <w:r>
+        <w:rPr>
+          <w:rFonts w:ascii="Times New Roman" w:hAnsi="Times New Roman"/>
           <w:b/>
+          <w:color w:val="000000"/>
           <w:sz w:val="24"/>
         </w:rPr>
         <w:t xml:space="preserve">CSPRNG Tokenization &amp; At-Rest Hash Isolation: </w:t>
@@ -952,17 +973,10 @@
       <w:r>
         <w:rPr>
           <w:rFonts w:ascii="Times New Roman" w:hAnsi="Times New Roman"/>
-          <w:sz w:val="24"/>
-        </w:rPr>
-        <w:t xml:space="preserve">Sharing tokens are created via Python's secrets module (256-bit entropy formatted as XXXX-XXXX). The raw token is returned </w:t>
-      </w:r>
-      <w:r>
-        <w:rPr>
-          <w:rFonts w:ascii="Times New Roman" w:hAnsi="Times New Roman"/>
-          <w:sz w:val="24"/>
-        </w:rPr>
-        <w:lastRenderedPageBreak/>
-        <w:t>solely to the uploader and never saved in plaintext; only its SHA-256 digest is indexed in PostgreSQL, protecting active links against database disclosure.</w:t>
+          <w:color w:val="000000"/>
+          <w:sz w:val="24"/>
+        </w:rPr>
+        <w:t>Sharing tokens are 8-digit human-friendly codes (approx. 26.4 bits entropy) generated via Python's secrets module (formatted as XXXX-XXXX). To protect active links against database disclosure, raw tokens are returned solely to the uploader and never saved in plaintext; only their 256-bit SHA-256 digests are indexed in PostgreSQL.</w:t>
       </w:r>
     </w:p>
     <w:p>
@@ -971,13 +985,21 @@
         <w:tabs>
           <w:tab w:val="num" w:pos="360"/>
         </w:tabs>
-        <w:spacing w:before="40" w:line="360" w:lineRule="auto"/>
+        <w:spacing w:before="40" w:line="360" w:lineRule="auto" w:after="80"/>
         <w:ind w:left="360" w:hanging="360"/>
       </w:pPr>
       <w:r>
         <w:rPr>
           <w:rFonts w:ascii="Times New Roman" w:hAnsi="Times New Roman"/>
+          <w:color w:val="000000"/>
+          <w:sz w:val="24"/>
+        </w:rPr>
+      </w:r>
+      <w:r>
+        <w:rPr>
+          <w:rFonts w:ascii="Times New Roman" w:hAnsi="Times New Roman"/>
           <w:b/>
+          <w:color w:val="000000"/>
           <w:sz w:val="24"/>
         </w:rPr>
         <w:t xml:space="preserve">In-Memory Multi-File &amp; Folder Bundling: </w:t>
@@ -985,9 +1007,10 @@
       <w:r>
         <w:rPr>
           <w:rFonts w:ascii="Times New Roman" w:hAnsi="Times New Roman"/>
-          <w:sz w:val="24"/>
-        </w:rPr>
-        <w:t>Users can drag-and-drop entire directory trees or multiple files up to 100 MB. FileGuard compresses them on the fly into an organized ZIP archive in memory, preserving folder paths without creating unencrypted temporary files on the host disk.</w:t>
+          <w:color w:val="000000"/>
+          <w:sz w:val="24"/>
+        </w:rPr>
+        <w:t>Users can drag-and-drop entire directory trees or multiple files up to 100 MB. FileGuard compresses them on the fly into an organized ZIP archive in memory using io.BytesIO streams, preserving folder paths without creating unencrypted temporary files on the host disk.</w:t>
       </w:r>
     </w:p>
     <w:p>
@@ -996,29 +1019,39 @@
         <w:tabs>
           <w:tab w:val="num" w:pos="360"/>
         </w:tabs>
-        <w:spacing w:before="40" w:line="360" w:lineRule="auto"/>
+        <w:spacing w:before="40" w:line="360" w:lineRule="auto" w:after="80"/>
         <w:ind w:left="360" w:hanging="360"/>
       </w:pPr>
       <w:r>
         <w:rPr>
           <w:rFonts w:ascii="Times New Roman" w:hAnsi="Times New Roman"/>
+          <w:color w:val="000000"/>
+          <w:sz w:val="24"/>
+        </w:rPr>
+      </w:r>
+      <w:r>
+        <w:rPr>
+          <w:rFonts w:ascii="Times New Roman" w:hAnsi="Times New Roman"/>
           <w:b/>
-          <w:sz w:val="24"/>
-        </w:rPr>
-        <w:t xml:space="preserve">CIDR Subnet Quota Enforcement: </w:t>
-      </w:r>
-      <w:r>
-        <w:rPr>
-          <w:rFonts w:ascii="Times New Roman" w:hAnsi="Times New Roman"/>
-          <w:sz w:val="24"/>
-        </w:rPr>
-        <w:t>To eliminate anonymous quota evasion via IPv6 rotation or dynamic IP reassignment, client IP addresses are normalized to /64 CIDR blocks (for IPv6) and /24 blocks (for IPv4). Each subnet is constrained to 100 MB per rolling 12-hour window.</w:t>
+          <w:color w:val="000000"/>
+          <w:sz w:val="24"/>
+        </w:rPr>
+        <w:t xml:space="preserve">Client-IP Upload Quota Enforcement: </w:t>
+      </w:r>
+      <w:r>
+        <w:rPr>
+          <w:rFonts w:ascii="Times New Roman" w:hAnsi="Times New Roman"/>
+          <w:color w:val="000000"/>
+          <w:sz w:val="24"/>
+        </w:rPr>
+        <w:t>To mitigate anonymous upload abuse and resource exhaustion, client IP addresses are extracted (sanitizing reverse-proxy headers) and constrained to an aggregate 100 MB quota over a rolling 12-hour window. Excess volume is rejected with HTTP 429.</w:t>
       </w:r>
     </w:p>
     <w:p>
       <w:pPr>
         <w:keepNext/>
         <w:spacing w:before="280" w:after="80" w:line="276" w:lineRule="auto"/>
+        <w:jc w:val="left"/>
       </w:pPr>
       <w:r>
         <w:rPr>
@@ -1032,13 +1065,14 @@
     </w:p>
     <w:p>
       <w:pPr>
-        <w:spacing w:after="120" w:line="360" w:lineRule="auto"/>
+        <w:spacing w:after="120" w:line="360" w:lineRule="auto" w:before="0"/>
         <w:jc w:val="both"/>
       </w:pPr>
       <w:r>
         <w:rPr>
           <w:rFonts w:ascii="Times New Roman" w:hAnsi="Times New Roman"/>
           <w:color w:val="000000"/>
+          <w:sz w:val="24"/>
         </w:rPr>
         <w:t>The administrative module provides structured security monitoring and tamper investigation capabilities:</w:t>
       </w:r>
@@ -1049,13 +1083,21 @@
         <w:tabs>
           <w:tab w:val="num" w:pos="360"/>
         </w:tabs>
-        <w:spacing w:before="40" w:line="360" w:lineRule="auto"/>
+        <w:spacing w:before="40" w:line="360" w:lineRule="auto" w:after="80"/>
         <w:ind w:left="360" w:hanging="360"/>
       </w:pPr>
       <w:r>
         <w:rPr>
           <w:rFonts w:ascii="Times New Roman" w:hAnsi="Times New Roman"/>
+          <w:color w:val="000000"/>
+          <w:sz w:val="24"/>
+        </w:rPr>
+      </w:r>
+      <w:r>
+        <w:rPr>
+          <w:rFonts w:ascii="Times New Roman" w:hAnsi="Times New Roman"/>
           <w:b/>
+          <w:color w:val="000000"/>
           <w:sz w:val="24"/>
         </w:rPr>
         <w:t xml:space="preserve">Interactive Bit-Flip Attack Simulator: </w:t>
@@ -1063,6 +1105,7 @@
       <w:r>
         <w:rPr>
           <w:rFonts w:ascii="Times New Roman" w:hAnsi="Times New Roman"/>
+          <w:color w:val="000000"/>
           <w:sz w:val="24"/>
         </w:rPr>
         <w:t>Enables evaluators to inject controlled 1-byte mutations into stored objects to observe real-time detection, HTTP 409 blocking, and automated forensic alert logging.</w:t>
@@ -1074,23 +1117,32 @@
         <w:tabs>
           <w:tab w:val="num" w:pos="360"/>
         </w:tabs>
-        <w:spacing w:before="40" w:line="360" w:lineRule="auto"/>
+        <w:spacing w:before="40" w:line="360" w:lineRule="auto" w:after="80"/>
         <w:ind w:left="360" w:hanging="360"/>
       </w:pPr>
       <w:r>
         <w:rPr>
           <w:rFonts w:ascii="Times New Roman" w:hAnsi="Times New Roman"/>
+          <w:color w:val="000000"/>
+          <w:sz w:val="24"/>
+        </w:rPr>
+      </w:r>
+      <w:r>
+        <w:rPr>
+          <w:rFonts w:ascii="Times New Roman" w:hAnsi="Times New Roman"/>
           <w:b/>
-          <w:sz w:val="24"/>
-        </w:rPr>
-        <w:t xml:space="preserve">Filesystem Inode &amp; Metadata Auditing: </w:t>
-      </w:r>
-      <w:r>
-        <w:rPr>
-          <w:rFonts w:ascii="Times New Roman" w:hAnsi="Times New Roman"/>
-          <w:sz w:val="24"/>
-        </w:rPr>
-        <w:t>Cross-references database timestamps with low-level OS stat attributes (ctime, mtime, atime) to uncover unauthorized out-of-band administrative tampering.</w:t>
+          <w:color w:val="000000"/>
+          <w:sz w:val="24"/>
+        </w:rPr>
+        <w:t xml:space="preserve">Local Host Filesystem Inode &amp; Metadata Auditing: </w:t>
+      </w:r>
+      <w:r>
+        <w:rPr>
+          <w:rFonts w:ascii="Times New Roman" w:hAnsi="Times New Roman"/>
+          <w:color w:val="000000"/>
+          <w:sz w:val="24"/>
+        </w:rPr>
+        <w:t>Cross-references database timestamps with low-level OS stat attributes (ctime, mtime, atime) across the host storage staging tier to uncover unauthorized out-of-band administrative tampering.</w:t>
       </w:r>
     </w:p>
     <w:p>
@@ -1099,20 +1151,29 @@
         <w:tabs>
           <w:tab w:val="num" w:pos="360"/>
         </w:tabs>
-        <w:spacing w:before="40" w:line="360" w:lineRule="auto"/>
+        <w:spacing w:before="40" w:line="360" w:lineRule="auto" w:after="80"/>
         <w:ind w:left="360" w:hanging="360"/>
       </w:pPr>
       <w:r>
         <w:rPr>
           <w:rFonts w:ascii="Times New Roman" w:hAnsi="Times New Roman"/>
+          <w:color w:val="000000"/>
+          <w:sz w:val="24"/>
+        </w:rPr>
+      </w:r>
+      <w:r>
+        <w:rPr>
+          <w:rFonts w:ascii="Times New Roman" w:hAnsi="Times New Roman"/>
           <w:b/>
-          <w:sz w:val="24"/>
-        </w:rPr>
-        <w:t xml:space="preserve">SIEM Audit Event Stream: </w:t>
-      </w:r>
-      <w:r>
-        <w:rPr>
-          <w:rFonts w:ascii="Times New Roman" w:hAnsi="Times New Roman"/>
+          <w:color w:val="000000"/>
+          <w:sz w:val="24"/>
+        </w:rPr>
+        <w:t xml:space="preserve">Security Audit Event Logger: </w:t>
+      </w:r>
+      <w:r>
+        <w:rPr>
+          <w:rFonts w:ascii="Times New Roman" w:hAnsi="Times New Roman"/>
+          <w:color w:val="000000"/>
           <w:sz w:val="24"/>
         </w:rPr>
         <w:t>Records events across five severity tiers (INFO, LOW, MEDIUM, HIGH, CRITICAL) and four outcomes (SUCCESS, BLOCKED, WARNING, FAILURE) with client IP telemetry.</w:t>
@@ -1122,6 +1183,7 @@
       <w:pPr>
         <w:keepNext/>
         <w:spacing w:before="280" w:after="80" w:line="276" w:lineRule="auto"/>
+        <w:jc w:val="left"/>
       </w:pPr>
       <w:r>
         <w:rPr>
@@ -1139,13 +1201,21 @@
         <w:tabs>
           <w:tab w:val="num" w:pos="360"/>
         </w:tabs>
-        <w:spacing w:before="40" w:line="360" w:lineRule="auto"/>
+        <w:spacing w:before="40" w:line="360" w:lineRule="auto" w:after="80"/>
         <w:ind w:left="360" w:hanging="360"/>
       </w:pPr>
       <w:r>
         <w:rPr>
           <w:rFonts w:ascii="Times New Roman" w:hAnsi="Times New Roman"/>
+          <w:color w:val="000000"/>
+          <w:sz w:val="24"/>
+        </w:rPr>
+      </w:r>
+      <w:r>
+        <w:rPr>
+          <w:rFonts w:ascii="Times New Roman" w:hAnsi="Times New Roman"/>
           <w:b/>
+          <w:color w:val="000000"/>
           <w:sz w:val="24"/>
         </w:rPr>
         <w:t xml:space="preserve">Multi-Threaded S3 Multipart Transfers: </w:t>
@@ -1153,6 +1223,7 @@
       <w:r>
         <w:rPr>
           <w:rFonts w:ascii="Times New Roman" w:hAnsi="Times New Roman"/>
+          <w:color w:val="000000"/>
           <w:sz w:val="24"/>
         </w:rPr>
         <w:t>Configured boto3 TransferConfig with 10 parallel threads and 256 KB memory buffers, drastically reducing latency for large document packages and video files.</w:t>
@@ -1164,13 +1235,21 @@
         <w:tabs>
           <w:tab w:val="num" w:pos="360"/>
         </w:tabs>
-        <w:spacing w:before="40" w:line="360" w:lineRule="auto"/>
+        <w:spacing w:before="40" w:line="360" w:lineRule="auto" w:after="80"/>
         <w:ind w:left="360" w:hanging="360"/>
       </w:pPr>
       <w:r>
         <w:rPr>
           <w:rFonts w:ascii="Times New Roman" w:hAnsi="Times New Roman"/>
+          <w:color w:val="000000"/>
+          <w:sz w:val="24"/>
+        </w:rPr>
+      </w:r>
+      <w:r>
+        <w:rPr>
+          <w:rFonts w:ascii="Times New Roman" w:hAnsi="Times New Roman"/>
           <w:b/>
+          <w:color w:val="000000"/>
           <w:sz w:val="24"/>
         </w:rPr>
         <w:t xml:space="preserve">10 GB Capacity Monitor &amp; 90% Threshold Alert: </w:t>
@@ -1178,9 +1257,10 @@
       <w:r>
         <w:rPr>
           <w:rFonts w:ascii="Times New Roman" w:hAnsi="Times New Roman"/>
-          <w:sz w:val="24"/>
-        </w:rPr>
-        <w:t>Continuously tallies active storage consumption against Backblaze B2 bucket limits, displaying real-time metrics and a 7-day usage trajectory chart.</w:t>
+          <w:color w:val="000000"/>
+          <w:sz w:val="24"/>
+        </w:rPr>
+        <w:t>Continuously tallies active storage consumption against Backblaze B2 bucket limits, displaying real-time metrics and an automated 7-day usage trajectory chart.</w:t>
       </w:r>
     </w:p>
     <w:p>
@@ -1189,30 +1269,39 @@
         <w:tabs>
           <w:tab w:val="num" w:pos="360"/>
         </w:tabs>
-        <w:spacing w:before="40" w:line="360" w:lineRule="auto"/>
+        <w:spacing w:before="40" w:line="360" w:lineRule="auto" w:after="80"/>
         <w:ind w:left="360" w:hanging="360"/>
       </w:pPr>
       <w:r>
         <w:rPr>
           <w:rFonts w:ascii="Times New Roman" w:hAnsi="Times New Roman"/>
+          <w:color w:val="000000"/>
+          <w:sz w:val="24"/>
+        </w:rPr>
+      </w:r>
+      <w:r>
+        <w:rPr>
+          <w:rFonts w:ascii="Times New Roman" w:hAnsi="Times New Roman"/>
           <w:b/>
-          <w:sz w:val="24"/>
-        </w:rPr>
-        <w:lastRenderedPageBreak/>
+          <w:color w:val="000000"/>
+          <w:sz w:val="24"/>
+        </w:rPr>
         <w:t xml:space="preserve">Automated Conditional Schema Migrations: </w:t>
       </w:r>
       <w:r>
         <w:rPr>
           <w:rFonts w:ascii="Times New Roman" w:hAnsi="Times New Roman"/>
-          <w:sz w:val="24"/>
-        </w:rPr>
-        <w:t>Embedded DDL migration handlers inside init_db.py dynamically apply schema adjustments during Render build cycles, preventing schema drift on serverless PostgreSQL.</w:t>
+          <w:color w:val="000000"/>
+          <w:sz w:val="24"/>
+        </w:rPr>
+        <w:t>Embedded DDL migration handlers dynamically apply schema adjustments during deployment cycles, preventing schema drift on serverless PostgreSQL.</w:t>
       </w:r>
     </w:p>
     <w:p>
       <w:pPr>
         <w:keepNext/>
         <w:spacing w:before="280" w:after="80" w:line="276" w:lineRule="auto"/>
+        <w:jc w:val="left"/>
       </w:pPr>
       <w:r>
         <w:rPr>
@@ -1230,13 +1319,21 @@
         <w:tabs>
           <w:tab w:val="num" w:pos="360"/>
         </w:tabs>
-        <w:spacing w:before="40" w:line="360" w:lineRule="auto"/>
+        <w:spacing w:before="40" w:line="360" w:lineRule="auto" w:after="80"/>
         <w:ind w:left="360" w:hanging="360"/>
       </w:pPr>
       <w:r>
         <w:rPr>
           <w:rFonts w:ascii="Times New Roman" w:hAnsi="Times New Roman"/>
+          <w:color w:val="000000"/>
+          <w:sz w:val="24"/>
+        </w:rPr>
+      </w:r>
+      <w:r>
+        <w:rPr>
+          <w:rFonts w:ascii="Times New Roman" w:hAnsi="Times New Roman"/>
           <w:b/>
+          <w:color w:val="000000"/>
           <w:sz w:val="24"/>
         </w:rPr>
         <w:t xml:space="preserve">Dual-Tab LocalStorage Vault (/history): </w:t>
@@ -1244,9 +1341,10 @@
       <w:r>
         <w:rPr>
           <w:rFonts w:ascii="Times New Roman" w:hAnsi="Times New Roman"/>
-          <w:sz w:val="24"/>
-        </w:rPr>
-        <w:t>Records 'Uploaded By Me' and 'Shared With Me (Viewed)' directly in client-side localStorage. No user accounts, passwords, or personal profiling exist on the server.</w:t>
+          <w:color w:val="000000"/>
+          <w:sz w:val="24"/>
+        </w:rPr>
+        <w:t>Records 'Uploaded By Me' and 'Shared With Me' directly in client-side localStorage. No user accounts, passwords, or personal profiling exist on the server.</w:t>
       </w:r>
     </w:p>
     <w:p>
@@ -1255,13 +1353,21 @@
         <w:tabs>
           <w:tab w:val="num" w:pos="360"/>
         </w:tabs>
-        <w:spacing w:before="40" w:line="360" w:lineRule="auto"/>
+        <w:spacing w:before="40" w:line="360" w:lineRule="auto" w:after="80"/>
         <w:ind w:left="360" w:hanging="360"/>
       </w:pPr>
       <w:r>
         <w:rPr>
           <w:rFonts w:ascii="Times New Roman" w:hAnsi="Times New Roman"/>
+          <w:color w:val="000000"/>
+          <w:sz w:val="24"/>
+        </w:rPr>
+      </w:r>
+      <w:r>
+        <w:rPr>
+          <w:rFonts w:ascii="Times New Roman" w:hAnsi="Times New Roman"/>
           <w:b/>
+          <w:color w:val="000000"/>
           <w:sz w:val="24"/>
         </w:rPr>
         <w:t xml:space="preserve">Live Batch Status Synchronization (/api/files/batch-status): </w:t>
@@ -1269,6 +1375,7 @@
       <w:r>
         <w:rPr>
           <w:rFonts w:ascii="Times New Roman" w:hAnsi="Times New Roman"/>
+          <w:color w:val="000000"/>
           <w:sz w:val="24"/>
         </w:rPr>
         <w:t>Queries up to 50 local tokens in a single JSON payload to update live status badges (Active, Expired, Revoked) and 1-second countdown tickers.</w:t>
@@ -1280,13 +1387,21 @@
         <w:tabs>
           <w:tab w:val="num" w:pos="360"/>
         </w:tabs>
-        <w:spacing w:before="40" w:line="360" w:lineRule="auto"/>
+        <w:spacing w:before="40" w:line="360" w:lineRule="auto" w:after="80"/>
         <w:ind w:left="360" w:hanging="360"/>
       </w:pPr>
       <w:r>
         <w:rPr>
           <w:rFonts w:ascii="Times New Roman" w:hAnsi="Times New Roman"/>
+          <w:color w:val="000000"/>
+          <w:sz w:val="24"/>
+        </w:rPr>
+      </w:r>
+      <w:r>
+        <w:rPr>
+          <w:rFonts w:ascii="Times New Roman" w:hAnsi="Times New Roman"/>
           <w:b/>
+          <w:color w:val="000000"/>
           <w:sz w:val="24"/>
         </w:rPr>
         <w:t xml:space="preserve">1-Click Early Remote Revocation: </w:t>
@@ -1294,6 +1409,7 @@
       <w:r>
         <w:rPr>
           <w:rFonts w:ascii="Times New Roman" w:hAnsi="Times New Roman"/>
+          <w:color w:val="000000"/>
           <w:sz w:val="24"/>
         </w:rPr>
         <w:t>Uploaders can immediately purge their active files from Backblaze B2 ahead of the 12-hour deadline, instantly invalidating the link.</w:t>
@@ -1303,6 +1419,7 @@
       <w:pPr>
         <w:keepNext/>
         <w:spacing w:before="280" w:after="80" w:line="276" w:lineRule="auto"/>
+        <w:jc w:val="left"/>
       </w:pPr>
       <w:r>
         <w:rPr>
@@ -1316,15 +1433,16 @@
     </w:p>
     <w:p>
       <w:pPr>
-        <w:spacing w:after="120" w:line="360" w:lineRule="auto"/>
+        <w:spacing w:after="120" w:line="360" w:lineRule="auto" w:before="0"/>
         <w:jc w:val="both"/>
       </w:pPr>
       <w:r>
         <w:rPr>
           <w:rFonts w:ascii="Times New Roman" w:hAnsi="Times New Roman"/>
           <w:color w:val="000000"/>
-        </w:rPr>
-        <w:t>FileGuard was validated with an automated Pytest test suite of 43 test cases covering functional, security, and SEO domains (100% pass rate):</w:t>
+          <w:sz w:val="24"/>
+        </w:rPr>
+        <w:t>FileGuard was validated with an automated Pytest test suite of 48 test cases covering functional, cryptographic integrity, security penetration (OWASP WSTG v4.2), and SEO domains (100% pass rate):</w:t>
       </w:r>
     </w:p>
     <w:tbl>
@@ -1438,7 +1556,7 @@
           </w:tcPr>
           <w:p>
             <w:pPr>
-              <w:spacing w:after="40" w:line="276" w:lineRule="auto"/>
+              <w:spacing w:line="276" w:lineRule="auto" w:after="40"/>
             </w:pPr>
             <w:r>
               <w:rPr>
@@ -1463,7 +1581,7 @@
           </w:tcPr>
           <w:p>
             <w:pPr>
-              <w:spacing w:after="40" w:line="276" w:lineRule="auto"/>
+              <w:spacing w:line="276" w:lineRule="auto" w:after="40"/>
             </w:pPr>
             <w:r>
               <w:rPr>
@@ -1488,7 +1606,7 @@
           </w:tcPr>
           <w:p>
             <w:pPr>
-              <w:spacing w:after="40" w:line="276" w:lineRule="auto"/>
+              <w:spacing w:line="276" w:lineRule="auto" w:after="40"/>
             </w:pPr>
             <w:r>
               <w:rPr>
@@ -1518,7 +1636,7 @@
           </w:tcPr>
           <w:p>
             <w:pPr>
-              <w:spacing w:after="40" w:line="276" w:lineRule="auto"/>
+              <w:spacing w:line="276" w:lineRule="auto" w:after="40"/>
             </w:pPr>
             <w:r>
               <w:rPr>
@@ -1543,7 +1661,7 @@
           </w:tcPr>
           <w:p>
             <w:pPr>
-              <w:spacing w:after="40" w:line="276" w:lineRule="auto"/>
+              <w:spacing w:line="276" w:lineRule="auto" w:after="40"/>
             </w:pPr>
             <w:r>
               <w:rPr>
@@ -1568,7 +1686,7 @@
           </w:tcPr>
           <w:p>
             <w:pPr>
-              <w:spacing w:after="40" w:line="276" w:lineRule="auto"/>
+              <w:spacing w:line="276" w:lineRule="auto" w:after="40"/>
             </w:pPr>
             <w:r>
               <w:rPr>
@@ -1598,7 +1716,7 @@
           </w:tcPr>
           <w:p>
             <w:pPr>
-              <w:spacing w:after="40" w:line="276" w:lineRule="auto"/>
+              <w:spacing w:line="276" w:lineRule="auto" w:after="40"/>
             </w:pPr>
             <w:r>
               <w:rPr>
@@ -1606,7 +1724,7 @@
                 <w:color w:val="000000"/>
                 <w:sz w:val="20"/>
               </w:rPr>
-              <w:t>Penetration &amp; Hardening</w:t>
+              <w:t>Penetration &amp; Hardening (OWASP WSTG v4.2)</w:t>
             </w:r>
           </w:p>
         </w:tc>
@@ -1623,7 +1741,7 @@
           </w:tcPr>
           <w:p>
             <w:pPr>
-              <w:spacing w:after="40" w:line="276" w:lineRule="auto"/>
+              <w:spacing w:line="276" w:lineRule="auto" w:after="40"/>
             </w:pPr>
             <w:r>
               <w:rPr>
@@ -1631,7 +1749,7 @@
                 <w:color w:val="000000"/>
                 <w:sz w:val="20"/>
               </w:rPr>
-              <w:t>Subnet quota saturation, CSRF injection, path traversal</w:t>
+              <w:t>Subnet quota, CSRF bypass, path traversal, stored XSS, IDOR, SQL injection</w:t>
             </w:r>
           </w:p>
         </w:tc>
@@ -1648,7 +1766,7 @@
           </w:tcPr>
           <w:p>
             <w:pPr>
-              <w:spacing w:after="40" w:line="276" w:lineRule="auto"/>
+              <w:spacing w:line="276" w:lineRule="auto" w:after="40"/>
             </w:pPr>
             <w:r>
               <w:rPr>
@@ -1656,7 +1774,7 @@
                 <w:color w:val="000000"/>
                 <w:sz w:val="20"/>
               </w:rPr>
-              <w:t>100% Pass — Subnet 429 triggered; path traversal sanitized</w:t>
+              <w:t>100% Pass — All 10 assessed OWASP vulnerability categories mitigated and verified resilient</w:t>
             </w:r>
           </w:p>
         </w:tc>
@@ -1678,7 +1796,7 @@
           </w:tcPr>
           <w:p>
             <w:pPr>
-              <w:spacing w:after="40" w:line="276" w:lineRule="auto"/>
+              <w:spacing w:line="276" w:lineRule="auto" w:after="40"/>
             </w:pPr>
             <w:r>
               <w:rPr>
@@ -1703,7 +1821,7 @@
           </w:tcPr>
           <w:p>
             <w:pPr>
-              <w:spacing w:after="40" w:line="276" w:lineRule="auto"/>
+              <w:spacing w:line="276" w:lineRule="auto" w:after="40"/>
             </w:pPr>
             <w:r>
               <w:rPr>
@@ -1728,7 +1846,7 @@
           </w:tcPr>
           <w:p>
             <w:pPr>
-              <w:spacing w:after="40" w:line="276" w:lineRule="auto"/>
+              <w:spacing w:line="276" w:lineRule="auto" w:after="40"/>
             </w:pPr>
             <w:r>
               <w:rPr>
@@ -1744,13 +1862,14 @@
     </w:tbl>
     <w:p>
       <w:pPr>
-        <w:spacing w:after="40"/>
+        <w:spacing w:after="40" w:before="0"/>
       </w:pPr>
     </w:p>
     <w:p>
       <w:pPr>
         <w:keepNext/>
         <w:spacing w:before="240" w:after="60" w:line="276" w:lineRule="auto"/>
+        <w:jc w:val="left"/>
       </w:pPr>
       <w:r>
         <w:rPr>
@@ -1768,23 +1887,32 @@
         <w:tabs>
           <w:tab w:val="num" w:pos="360"/>
         </w:tabs>
-        <w:spacing w:before="40" w:line="360" w:lineRule="auto"/>
+        <w:spacing w:before="40" w:line="360" w:lineRule="auto" w:after="80"/>
         <w:ind w:left="360" w:hanging="360"/>
       </w:pPr>
       <w:r>
         <w:rPr>
           <w:rFonts w:ascii="Times New Roman" w:hAnsi="Times New Roman"/>
+          <w:color w:val="000000"/>
+          <w:sz w:val="24"/>
+        </w:rPr>
+      </w:r>
+      <w:r>
+        <w:rPr>
+          <w:rFonts w:ascii="Times New Roman" w:hAnsi="Times New Roman"/>
           <w:b/>
-          <w:sz w:val="24"/>
-        </w:rPr>
-        <w:t xml:space="preserve">Aaditya Abhijit (Student ID: 245811404): </w:t>
-      </w:r>
-      <w:r>
-        <w:rPr>
-          <w:rFonts w:ascii="Times New Roman" w:hAnsi="Times New Roman"/>
-          <w:sz w:val="24"/>
-        </w:rPr>
-        <w:t>Engineered the SHA-256 cryptographic pre-flight verification pipeline; built the OS filesystem inode metadata auditing module; created the interactive bit-flip tampering simulator; designed the structured SIEM security event logger; developed automated test suites for file tampering and missing file detection.</w:t>
+          <w:color w:val="000000"/>
+          <w:sz w:val="24"/>
+        </w:rPr>
+        <w:t xml:space="preserve">Aditya Abhijit (Student ID: 245811404): </w:t>
+      </w:r>
+      <w:r>
+        <w:rPr>
+          <w:rFonts w:ascii="Times New Roman" w:hAnsi="Times New Roman"/>
+          <w:color w:val="000000"/>
+          <w:sz w:val="24"/>
+        </w:rPr>
+        <w:t>Engineered the SHA-256 cryptographic pre-flight verification pipeline; built the OS filesystem inode metadata auditing module; created the interactive bit-flip tampering simulator; designed the structured security audit event logger; developed automated test suites for file tampering and missing file detection.</w:t>
       </w:r>
     </w:p>
     <w:p>
@@ -1793,30 +1921,39 @@
         <w:tabs>
           <w:tab w:val="num" w:pos="360"/>
         </w:tabs>
-        <w:spacing w:before="40" w:line="360" w:lineRule="auto"/>
+        <w:spacing w:before="40" w:line="360" w:lineRule="auto" w:after="80"/>
         <w:ind w:left="360" w:hanging="360"/>
       </w:pPr>
       <w:r>
         <w:rPr>
           <w:rFonts w:ascii="Times New Roman" w:hAnsi="Times New Roman"/>
+          <w:color w:val="000000"/>
+          <w:sz w:val="24"/>
+        </w:rPr>
+      </w:r>
+      <w:r>
+        <w:rPr>
+          <w:rFonts w:ascii="Times New Roman" w:hAnsi="Times New Roman"/>
           <w:b/>
-          <w:sz w:val="24"/>
-        </w:rPr>
-        <w:lastRenderedPageBreak/>
+          <w:color w:val="000000"/>
+          <w:sz w:val="24"/>
+        </w:rPr>
         <w:t xml:space="preserve">Deeptanil Sinha (Student ID: 245811402): </w:t>
       </w:r>
       <w:r>
         <w:rPr>
           <w:rFonts w:ascii="Times New Roman" w:hAnsi="Times New Roman"/>
-          <w:sz w:val="24"/>
-        </w:rPr>
-        <w:t>Designed the end-to-end full-stack architecture and Neo-Brutalist UI; engineered the in-memory streaming ZIP packager for folder uploads; implemented CIDR-normalized subnet quota controls; integrated Neon Serverless PostgreSQL and Backblaze B2 S3 multipart transfers; developed the client-side localStorage vault with batch status synchronization.</w:t>
+          <w:color w:val="000000"/>
+          <w:sz w:val="24"/>
+        </w:rPr>
+        <w:t>Designed the end-to-end full-stack architecture and Neo-Brutalist UI; engineered the in-memory streaming ZIP packager for folder uploads; implemented client-IP quota controls; integrated Neon Serverless PostgreSQL and Backblaze B2 S3 multipart transfers; developed the client-side localStorage vault with batch status synchronization.</w:t>
       </w:r>
     </w:p>
     <w:p>
       <w:pPr>
         <w:keepNext/>
         <w:spacing w:before="280" w:after="80" w:line="276" w:lineRule="auto"/>
+        <w:jc w:val="left"/>
       </w:pPr>
       <w:r>
         <w:rPr>
@@ -1830,29 +1967,16 @@
     </w:p>
     <w:p>
       <w:pPr>
-        <w:spacing w:after="120" w:line="360" w:lineRule="auto"/>
+        <w:spacing w:after="120" w:line="360" w:lineRule="auto" w:before="0"/>
         <w:jc w:val="both"/>
       </w:pPr>
       <w:r>
         <w:rPr>
           <w:rFonts w:ascii="Times New Roman" w:hAnsi="Times New Roman"/>
           <w:color w:val="000000"/>
-        </w:rPr>
-        <w:t>FileGuard demonstrates that temporary file sharing can achieve enterprise-grade security without sacrificing user convenience or privacy. By coupling strict 12-hour self-destruct routines, in-memory folder compression, pre-flight cryptographic validation, and zero-knowledge client vaults, FileGuard provides a robust reference implementation for Information &amp; Network Security.</w:t>
-      </w:r>
-      <w:r>
-        <w:rPr>
-          <w:rFonts w:ascii="Times New Roman" w:hAnsi="Times New Roman"/>
-          <w:color w:val="000000"/>
-        </w:rPr>
-        <w:t xml:space="preserve"> A live preview can be seen at the following link: </w:t>
-      </w:r>
-      <w:r>
-        <w:rPr>
-          <w:rFonts w:ascii="Times New Roman" w:hAnsi="Times New Roman"/>
-          <w:color w:val="000000"/>
-        </w:rPr>
-        <w:t>https://files.deeptanil.in/</w:t>
+          <w:sz w:val="24"/>
+        </w:rPr>
+        <w:t>FileGuard demonstrates that temporary file sharing can achieve robust security without sacrificing user convenience or privacy. By coupling strict 12-hour automated purging, transparent AES-256-GCM encryption at rest, in-memory folder compression, pre-flight cryptographic validation, and anonymous client-side vaults, FileGuard provides a resilient reference implementation for Information &amp; Network Security. A live preview can be inspected at: https://files.deeptanil.in</w:t>
       </w:r>
     </w:p>
     <w:sectPr>

</xml_diff>

<commit_message>
feat: add Vercel Web Analytics integration and update .gitignore for Node.js files
</commit_message>
<xml_diff>
--- a/FileGuard_Project_Report.docx
+++ b/FileGuard_Project_Report.docx
@@ -144,7 +144,23 @@
           <w:sz w:val="44"/>
           <w:szCs w:val="44"/>
         </w:rPr>
-        <w:t>_3121 : INFORMATION SECURITY</w:t>
+        <w:t>_</w:t>
+      </w:r>
+      <w:proofErr w:type="gramStart"/>
+      <w:r>
+        <w:rPr>
+          <w:sz w:val="44"/>
+          <w:szCs w:val="44"/>
+        </w:rPr>
+        <w:t>3121 :</w:t>
+      </w:r>
+      <w:proofErr w:type="gramEnd"/>
+      <w:r>
+        <w:rPr>
+          <w:sz w:val="44"/>
+          <w:szCs w:val="44"/>
+        </w:rPr>
+        <w:t xml:space="preserve"> INFORMATION SECURITY</w:t>
       </w:r>
       <w:r>
         <w:rPr>
@@ -339,7 +355,6 @@
       <w:pPr>
         <w:keepNext/>
         <w:spacing w:before="280" w:after="80" w:line="276" w:lineRule="auto"/>
-        <w:jc w:val="left"/>
       </w:pPr>
       <w:r>
         <w:rPr>
@@ -348,28 +363,59 @@
           <w:color w:val="000000"/>
           <w:sz w:val="28"/>
         </w:rPr>
+        <w:lastRenderedPageBreak/>
         <w:t>1. Abstract &amp; Problem Statement</w:t>
       </w:r>
     </w:p>
     <w:p>
       <w:pPr>
-        <w:spacing w:after="120" w:line="360" w:lineRule="auto" w:before="0"/>
+        <w:spacing w:after="120" w:line="360" w:lineRule="auto"/>
         <w:jc w:val="both"/>
       </w:pPr>
       <w:r>
         <w:rPr>
           <w:rFonts w:ascii="Times New Roman" w:hAnsi="Times New Roman"/>
           <w:color w:val="000000"/>
-          <w:sz w:val="24"/>
-        </w:rPr>
-        <w:t>Temporary file transmission across open networks presents critical security vulnerabilities: persistent data exposure on remote servers, silent data corruption (bit-rot or malicious in-flight modification), unauthorized token enumeration, and intrusive user tracking. FileGuard is an academic and production-oriented web platform providing privacy-focused temporary file sharing. It implements transparent AES-256-GCM encryption at rest, strict 12-hour automated lifecycle purging, pre-flight SHA-256 cryptographic verification, in-memory folder ZIP bundling, client-IP upload quota controls, and an administrative digital forensics inspection lab.</w:t>
+        </w:rPr>
+        <w:t>Temporary file transmission across open networks presents critical security vulnerabilities: persistent data exposure on remote servers, silent data corruption (bit-</w:t>
+      </w:r>
+      <w:proofErr w:type="spellStart"/>
+      <w:r>
+        <w:rPr>
+          <w:rFonts w:ascii="Times New Roman" w:hAnsi="Times New Roman"/>
+          <w:color w:val="000000"/>
+        </w:rPr>
+        <w:t>rot or</w:t>
+      </w:r>
+      <w:proofErr w:type="spellEnd"/>
+      <w:r>
+        <w:rPr>
+          <w:rFonts w:ascii="Times New Roman" w:hAnsi="Times New Roman"/>
+          <w:color w:val="000000"/>
+        </w:rPr>
+        <w:t xml:space="preserve"> malicious in-flight modification), unauthorized token enumeration, and intrusive user tracking. </w:t>
+      </w:r>
+      <w:proofErr w:type="spellStart"/>
+      <w:r>
+        <w:rPr>
+          <w:rFonts w:ascii="Times New Roman" w:hAnsi="Times New Roman"/>
+          <w:color w:val="000000"/>
+        </w:rPr>
+        <w:t>FileGuard</w:t>
+      </w:r>
+      <w:proofErr w:type="spellEnd"/>
+      <w:r>
+        <w:rPr>
+          <w:rFonts w:ascii="Times New Roman" w:hAnsi="Times New Roman"/>
+          <w:color w:val="000000"/>
+        </w:rPr>
+        <w:t xml:space="preserve"> is an academic and production-oriented web platform providing privacy-focused temporary file sharing. It implements transparent AES-256-GCM encryption at rest, strict 12-hour automated lifecycle purging, pre-flight SHA-256 cryptographic verification, in-memory folder ZIP bundling, client-IP upload quota controls, and an administrative digital forensics inspection lab.</w:t>
       </w:r>
     </w:p>
     <w:p>
       <w:pPr>
         <w:keepNext/>
         <w:spacing w:before="280" w:after="80" w:line="276" w:lineRule="auto"/>
-        <w:jc w:val="left"/>
       </w:pPr>
       <w:r>
         <w:rPr>
@@ -383,14 +429,13 @@
     </w:p>
     <w:p>
       <w:pPr>
-        <w:spacing w:after="120" w:line="360" w:lineRule="auto" w:before="0"/>
+        <w:spacing w:after="120" w:line="360" w:lineRule="auto"/>
         <w:jc w:val="both"/>
       </w:pPr>
       <w:r>
         <w:rPr>
           <w:rFonts w:ascii="Times New Roman" w:hAnsi="Times New Roman"/>
           <w:color w:val="000000"/>
-          <w:sz w:val="24"/>
         </w:rPr>
         <w:t>The system coordinates web routing, object storage, and relational state without disk bottlenecks or unencrypted staging leaks:</w:t>
       </w:r>
@@ -402,9 +447,9 @@
         <w:tblLook w:val="04A0" w:firstRow="1" w:lastRow="0" w:firstColumn="1" w:lastColumn="0" w:noHBand="0" w:noVBand="1"/>
       </w:tblPr>
       <w:tblGrid>
-        <w:gridCol w:w="2743"/>
-        <w:gridCol w:w="2751"/>
-        <w:gridCol w:w="3866"/>
+        <w:gridCol w:w="3164"/>
+        <w:gridCol w:w="3166"/>
+        <w:gridCol w:w="4470"/>
       </w:tblGrid>
       <w:tr>
         <w:trPr>
@@ -506,7 +551,7 @@
           </w:tcPr>
           <w:p>
             <w:pPr>
-              <w:spacing w:line="276" w:lineRule="auto" w:after="40"/>
+              <w:spacing w:after="40" w:line="276" w:lineRule="auto"/>
             </w:pPr>
             <w:r>
               <w:rPr>
@@ -531,7 +576,7 @@
           </w:tcPr>
           <w:p>
             <w:pPr>
-              <w:spacing w:line="276" w:lineRule="auto" w:after="40"/>
+              <w:spacing w:after="40" w:line="276" w:lineRule="auto"/>
             </w:pPr>
             <w:r>
               <w:rPr>
@@ -539,8 +584,18 @@
                 <w:color w:val="000000"/>
                 <w:sz w:val="20"/>
               </w:rPr>
-              <w:t>Python 3.14 / Flask / Gunicorn</w:t>
+              <w:t xml:space="preserve">Python 3.14 / Flask / </w:t>
             </w:r>
+            <w:proofErr w:type="spellStart"/>
+            <w:r>
+              <w:rPr>
+                <w:rFonts w:ascii="Times New Roman" w:hAnsi="Times New Roman"/>
+                <w:color w:val="000000"/>
+                <w:sz w:val="20"/>
+              </w:rPr>
+              <w:t>Gunicorn</w:t>
+            </w:r>
+            <w:proofErr w:type="spellEnd"/>
           </w:p>
         </w:tc>
         <w:tc>
@@ -556,7 +611,7 @@
           </w:tcPr>
           <w:p>
             <w:pPr>
-              <w:spacing w:line="276" w:lineRule="auto" w:after="40"/>
+              <w:spacing w:after="40" w:line="276" w:lineRule="auto"/>
             </w:pPr>
             <w:r>
               <w:rPr>
@@ -564,7 +619,25 @@
                 <w:color w:val="000000"/>
                 <w:sz w:val="20"/>
               </w:rPr>
-              <w:t>Enforces CSPRNG tokenization, CSRF protection, nosniff &amp; CSP defensive headers</w:t>
+              <w:t xml:space="preserve">Enforces CSPRNG tokenization, CSRF protection, </w:t>
+            </w:r>
+            <w:proofErr w:type="spellStart"/>
+            <w:r>
+              <w:rPr>
+                <w:rFonts w:ascii="Times New Roman" w:hAnsi="Times New Roman"/>
+                <w:color w:val="000000"/>
+                <w:sz w:val="20"/>
+              </w:rPr>
+              <w:t>nosniff</w:t>
+            </w:r>
+            <w:proofErr w:type="spellEnd"/>
+            <w:r>
+              <w:rPr>
+                <w:rFonts w:ascii="Times New Roman" w:hAnsi="Times New Roman"/>
+                <w:color w:val="000000"/>
+                <w:sz w:val="20"/>
+              </w:rPr>
+              <w:t xml:space="preserve"> &amp; CSP defensive headers</w:t>
             </w:r>
           </w:p>
         </w:tc>
@@ -586,7 +659,7 @@
           </w:tcPr>
           <w:p>
             <w:pPr>
-              <w:spacing w:line="276" w:lineRule="auto" w:after="40"/>
+              <w:spacing w:after="40" w:line="276" w:lineRule="auto"/>
             </w:pPr>
             <w:r>
               <w:rPr>
@@ -611,7 +684,7 @@
           </w:tcPr>
           <w:p>
             <w:pPr>
-              <w:spacing w:line="276" w:lineRule="auto" w:after="40"/>
+              <w:spacing w:after="40" w:line="276" w:lineRule="auto"/>
             </w:pPr>
             <w:r>
               <w:rPr>
@@ -636,7 +709,7 @@
           </w:tcPr>
           <w:p>
             <w:pPr>
-              <w:spacing w:line="276" w:lineRule="auto" w:after="40"/>
+              <w:spacing w:after="40" w:line="276" w:lineRule="auto"/>
             </w:pPr>
             <w:r>
               <w:rPr>
@@ -666,7 +739,7 @@
           </w:tcPr>
           <w:p>
             <w:pPr>
-              <w:spacing w:line="276" w:lineRule="auto" w:after="40"/>
+              <w:spacing w:after="40" w:line="276" w:lineRule="auto"/>
             </w:pPr>
             <w:r>
               <w:rPr>
@@ -691,15 +764,25 @@
           </w:tcPr>
           <w:p>
             <w:pPr>
-              <w:spacing w:line="276" w:lineRule="auto" w:after="40"/>
+              <w:spacing w:after="40" w:line="276" w:lineRule="auto"/>
             </w:pPr>
+            <w:proofErr w:type="spellStart"/>
             <w:r>
               <w:rPr>
                 <w:rFonts w:ascii="Times New Roman" w:hAnsi="Times New Roman"/>
                 <w:color w:val="000000"/>
                 <w:sz w:val="20"/>
               </w:rPr>
-              <w:t>Backblaze B2 S3 (boto3)</w:t>
+              <w:t>Backblaze</w:t>
+            </w:r>
+            <w:proofErr w:type="spellEnd"/>
+            <w:r>
+              <w:rPr>
+                <w:rFonts w:ascii="Times New Roman" w:hAnsi="Times New Roman"/>
+                <w:color w:val="000000"/>
+                <w:sz w:val="20"/>
+              </w:rPr>
+              <w:t xml:space="preserve"> B2 S3 (boto3)</w:t>
             </w:r>
           </w:p>
         </w:tc>
@@ -716,7 +799,7 @@
           </w:tcPr>
           <w:p>
             <w:pPr>
-              <w:spacing w:line="276" w:lineRule="auto" w:after="40"/>
+              <w:spacing w:after="40" w:line="276" w:lineRule="auto"/>
             </w:pPr>
             <w:r>
               <w:rPr>
@@ -746,7 +829,7 @@
           </w:tcPr>
           <w:p>
             <w:pPr>
-              <w:spacing w:line="276" w:lineRule="auto" w:after="40"/>
+              <w:spacing w:after="40" w:line="276" w:lineRule="auto"/>
             </w:pPr>
             <w:r>
               <w:rPr>
@@ -771,7 +854,7 @@
           </w:tcPr>
           <w:p>
             <w:pPr>
-              <w:spacing w:line="276" w:lineRule="auto" w:after="40"/>
+              <w:spacing w:after="40" w:line="276" w:lineRule="auto"/>
             </w:pPr>
             <w:r>
               <w:rPr>
@@ -796,7 +879,7 @@
           </w:tcPr>
           <w:p>
             <w:pPr>
-              <w:spacing w:line="276" w:lineRule="auto" w:after="40"/>
+              <w:spacing w:after="40" w:line="276" w:lineRule="auto"/>
             </w:pPr>
             <w:r>
               <w:rPr>
@@ -826,7 +909,7 @@
           </w:tcPr>
           <w:p>
             <w:pPr>
-              <w:spacing w:line="276" w:lineRule="auto" w:after="40"/>
+              <w:spacing w:after="40" w:line="276" w:lineRule="auto"/>
             </w:pPr>
             <w:r>
               <w:rPr>
@@ -851,7 +934,7 @@
           </w:tcPr>
           <w:p>
             <w:pPr>
-              <w:spacing w:line="276" w:lineRule="auto" w:after="40"/>
+              <w:spacing w:after="40" w:line="276" w:lineRule="auto"/>
             </w:pPr>
             <w:r>
               <w:rPr>
@@ -876,7 +959,7 @@
           </w:tcPr>
           <w:p>
             <w:pPr>
-              <w:spacing w:line="276" w:lineRule="auto" w:after="40"/>
+              <w:spacing w:after="40" w:line="276" w:lineRule="auto"/>
             </w:pPr>
             <w:r>
               <w:rPr>
@@ -892,14 +975,13 @@
     </w:tbl>
     <w:p>
       <w:pPr>
-        <w:spacing w:after="40" w:before="0"/>
+        <w:spacing w:after="40"/>
       </w:pPr>
     </w:p>
     <w:p>
       <w:pPr>
         <w:keepNext/>
         <w:spacing w:before="280" w:after="80" w:line="276" w:lineRule="auto"/>
-        <w:jc w:val="left"/>
       </w:pPr>
       <w:r>
         <w:rPr>
@@ -917,21 +999,13 @@
         <w:tabs>
           <w:tab w:val="num" w:pos="360"/>
         </w:tabs>
-        <w:spacing w:before="40" w:line="360" w:lineRule="auto" w:after="80"/>
+        <w:spacing w:before="40" w:line="360" w:lineRule="auto"/>
         <w:ind w:left="360" w:hanging="360"/>
       </w:pPr>
       <w:r>
         <w:rPr>
           <w:rFonts w:ascii="Times New Roman" w:hAnsi="Times New Roman"/>
-          <w:color w:val="000000"/>
-          <w:sz w:val="24"/>
-        </w:rPr>
-      </w:r>
-      <w:r>
-        <w:rPr>
-          <w:rFonts w:ascii="Times New Roman" w:hAnsi="Times New Roman"/>
           <w:b/>
-          <w:color w:val="000000"/>
           <w:sz w:val="24"/>
         </w:rPr>
         <w:t xml:space="preserve">Pre-Flight SHA-256 Anti-Tamper Gate: </w:t>
@@ -939,7 +1013,6 @@
       <w:r>
         <w:rPr>
           <w:rFonts w:ascii="Times New Roman" w:hAnsi="Times New Roman"/>
-          <w:color w:val="000000"/>
           <w:sz w:val="24"/>
         </w:rPr>
         <w:t>During upload, an authoritative SHA-256 reference hash is calculated chunk-by-chunk and committed to PostgreSQL. On download, the server hashes the storage block before streaming bytes to the client. Any 1-bit variance triggers an immediate HTTP 409 Anti-Tamper block, logs a CRITICAL security event, and aborts delivery.</w:t>
@@ -951,21 +1024,13 @@
         <w:tabs>
           <w:tab w:val="num" w:pos="360"/>
         </w:tabs>
-        <w:spacing w:before="40" w:line="360" w:lineRule="auto" w:after="80"/>
+        <w:spacing w:before="40" w:line="360" w:lineRule="auto"/>
         <w:ind w:left="360" w:hanging="360"/>
       </w:pPr>
       <w:r>
         <w:rPr>
           <w:rFonts w:ascii="Times New Roman" w:hAnsi="Times New Roman"/>
-          <w:color w:val="000000"/>
-          <w:sz w:val="24"/>
-        </w:rPr>
-      </w:r>
-      <w:r>
-        <w:rPr>
-          <w:rFonts w:ascii="Times New Roman" w:hAnsi="Times New Roman"/>
           <w:b/>
-          <w:color w:val="000000"/>
           <w:sz w:val="24"/>
         </w:rPr>
         <w:t xml:space="preserve">CSPRNG Tokenization &amp; At-Rest Hash Isolation: </w:t>
@@ -973,7 +1038,6 @@
       <w:r>
         <w:rPr>
           <w:rFonts w:ascii="Times New Roman" w:hAnsi="Times New Roman"/>
-          <w:color w:val="000000"/>
           <w:sz w:val="24"/>
         </w:rPr>
         <w:t>Sharing tokens are 8-digit human-friendly codes (approx. 26.4 bits entropy) generated via Python's secrets module (formatted as XXXX-XXXX). To protect active links against database disclosure, raw tokens are returned solely to the uploader and never saved in plaintext; only their 256-bit SHA-256 digests are indexed in PostgreSQL.</w:t>
@@ -985,21 +1049,13 @@
         <w:tabs>
           <w:tab w:val="num" w:pos="360"/>
         </w:tabs>
-        <w:spacing w:before="40" w:line="360" w:lineRule="auto" w:after="80"/>
+        <w:spacing w:before="40" w:line="360" w:lineRule="auto"/>
         <w:ind w:left="360" w:hanging="360"/>
       </w:pPr>
       <w:r>
         <w:rPr>
           <w:rFonts w:ascii="Times New Roman" w:hAnsi="Times New Roman"/>
-          <w:color w:val="000000"/>
-          <w:sz w:val="24"/>
-        </w:rPr>
-      </w:r>
-      <w:r>
-        <w:rPr>
-          <w:rFonts w:ascii="Times New Roman" w:hAnsi="Times New Roman"/>
           <w:b/>
-          <w:color w:val="000000"/>
           <w:sz w:val="24"/>
         </w:rPr>
         <w:t xml:space="preserve">In-Memory Multi-File &amp; Folder Bundling: </w:t>
@@ -1007,10 +1063,43 @@
       <w:r>
         <w:rPr>
           <w:rFonts w:ascii="Times New Roman" w:hAnsi="Times New Roman"/>
-          <w:color w:val="000000"/>
-          <w:sz w:val="24"/>
-        </w:rPr>
-        <w:t>Users can drag-and-drop entire directory trees or multiple files up to 100 MB. FileGuard compresses them on the fly into an organized ZIP archive in memory using io.BytesIO streams, preserving folder paths without creating unencrypted temporary files on the host disk.</w:t>
+          <w:sz w:val="24"/>
+        </w:rPr>
+        <w:t xml:space="preserve">Users can drag-and-drop entire directory trees or multiple files up to 100 MB. </w:t>
+      </w:r>
+      <w:proofErr w:type="spellStart"/>
+      <w:r>
+        <w:rPr>
+          <w:rFonts w:ascii="Times New Roman" w:hAnsi="Times New Roman"/>
+          <w:sz w:val="24"/>
+        </w:rPr>
+        <w:t>FileGuard</w:t>
+      </w:r>
+      <w:proofErr w:type="spellEnd"/>
+      <w:r>
+        <w:rPr>
+          <w:rFonts w:ascii="Times New Roman" w:hAnsi="Times New Roman"/>
+          <w:sz w:val="24"/>
+        </w:rPr>
+        <w:t xml:space="preserve"> compresses them on the fly into an organized ZIP archive in memory using </w:t>
+      </w:r>
+      <w:proofErr w:type="spellStart"/>
+      <w:proofErr w:type="gramStart"/>
+      <w:r>
+        <w:rPr>
+          <w:rFonts w:ascii="Times New Roman" w:hAnsi="Times New Roman"/>
+          <w:sz w:val="24"/>
+        </w:rPr>
+        <w:t>io.BytesIO</w:t>
+      </w:r>
+      <w:proofErr w:type="spellEnd"/>
+      <w:proofErr w:type="gramEnd"/>
+      <w:r>
+        <w:rPr>
+          <w:rFonts w:ascii="Times New Roman" w:hAnsi="Times New Roman"/>
+          <w:sz w:val="24"/>
+        </w:rPr>
+        <w:t xml:space="preserve"> streams, preserving folder paths without creating unencrypted temporary files on the host disk.</w:t>
       </w:r>
     </w:p>
     <w:p>
@@ -1019,29 +1108,21 @@
         <w:tabs>
           <w:tab w:val="num" w:pos="360"/>
         </w:tabs>
-        <w:spacing w:before="40" w:line="360" w:lineRule="auto" w:after="80"/>
+        <w:spacing w:before="40" w:line="360" w:lineRule="auto"/>
         <w:ind w:left="360" w:hanging="360"/>
       </w:pPr>
       <w:r>
         <w:rPr>
           <w:rFonts w:ascii="Times New Roman" w:hAnsi="Times New Roman"/>
-          <w:color w:val="000000"/>
-          <w:sz w:val="24"/>
-        </w:rPr>
-      </w:r>
-      <w:r>
-        <w:rPr>
-          <w:rFonts w:ascii="Times New Roman" w:hAnsi="Times New Roman"/>
           <w:b/>
-          <w:color w:val="000000"/>
-          <w:sz w:val="24"/>
-        </w:rPr>
+          <w:sz w:val="24"/>
+        </w:rPr>
+        <w:lastRenderedPageBreak/>
         <w:t xml:space="preserve">Client-IP Upload Quota Enforcement: </w:t>
       </w:r>
       <w:r>
         <w:rPr>
           <w:rFonts w:ascii="Times New Roman" w:hAnsi="Times New Roman"/>
-          <w:color w:val="000000"/>
           <w:sz w:val="24"/>
         </w:rPr>
         <w:t>To mitigate anonymous upload abuse and resource exhaustion, client IP addresses are extracted (sanitizing reverse-proxy headers) and constrained to an aggregate 100 MB quota over a rolling 12-hour window. Excess volume is rejected with HTTP 429.</w:t>
@@ -1051,7 +1132,6 @@
       <w:pPr>
         <w:keepNext/>
         <w:spacing w:before="280" w:after="80" w:line="276" w:lineRule="auto"/>
-        <w:jc w:val="left"/>
       </w:pPr>
       <w:r>
         <w:rPr>
@@ -1065,14 +1145,13 @@
     </w:p>
     <w:p>
       <w:pPr>
-        <w:spacing w:after="120" w:line="360" w:lineRule="auto" w:before="0"/>
+        <w:spacing w:after="120" w:line="360" w:lineRule="auto"/>
         <w:jc w:val="both"/>
       </w:pPr>
       <w:r>
         <w:rPr>
           <w:rFonts w:ascii="Times New Roman" w:hAnsi="Times New Roman"/>
           <w:color w:val="000000"/>
-          <w:sz w:val="24"/>
         </w:rPr>
         <w:t>The administrative module provides structured security monitoring and tamper investigation capabilities:</w:t>
       </w:r>
@@ -1083,21 +1162,13 @@
         <w:tabs>
           <w:tab w:val="num" w:pos="360"/>
         </w:tabs>
-        <w:spacing w:before="40" w:line="360" w:lineRule="auto" w:after="80"/>
+        <w:spacing w:before="40" w:line="360" w:lineRule="auto"/>
         <w:ind w:left="360" w:hanging="360"/>
       </w:pPr>
       <w:r>
         <w:rPr>
           <w:rFonts w:ascii="Times New Roman" w:hAnsi="Times New Roman"/>
-          <w:color w:val="000000"/>
-          <w:sz w:val="24"/>
-        </w:rPr>
-      </w:r>
-      <w:r>
-        <w:rPr>
-          <w:rFonts w:ascii="Times New Roman" w:hAnsi="Times New Roman"/>
           <w:b/>
-          <w:color w:val="000000"/>
           <w:sz w:val="24"/>
         </w:rPr>
         <w:t xml:space="preserve">Interactive Bit-Flip Attack Simulator: </w:t>
@@ -1105,7 +1176,6 @@
       <w:r>
         <w:rPr>
           <w:rFonts w:ascii="Times New Roman" w:hAnsi="Times New Roman"/>
-          <w:color w:val="000000"/>
           <w:sz w:val="24"/>
         </w:rPr>
         <w:t>Enables evaluators to inject controlled 1-byte mutations into stored objects to observe real-time detection, HTTP 409 blocking, and automated forensic alert logging.</w:t>
@@ -1117,32 +1187,89 @@
         <w:tabs>
           <w:tab w:val="num" w:pos="360"/>
         </w:tabs>
-        <w:spacing w:before="40" w:line="360" w:lineRule="auto" w:after="80"/>
+        <w:spacing w:before="40" w:line="360" w:lineRule="auto"/>
         <w:ind w:left="360" w:hanging="360"/>
       </w:pPr>
       <w:r>
         <w:rPr>
           <w:rFonts w:ascii="Times New Roman" w:hAnsi="Times New Roman"/>
-          <w:color w:val="000000"/>
-          <w:sz w:val="24"/>
-        </w:rPr>
-      </w:r>
-      <w:r>
-        <w:rPr>
-          <w:rFonts w:ascii="Times New Roman" w:hAnsi="Times New Roman"/>
           <w:b/>
-          <w:color w:val="000000"/>
-          <w:sz w:val="24"/>
-        </w:rPr>
-        <w:t xml:space="preserve">Local Host Filesystem Inode &amp; Metadata Auditing: </w:t>
-      </w:r>
-      <w:r>
-        <w:rPr>
-          <w:rFonts w:ascii="Times New Roman" w:hAnsi="Times New Roman"/>
-          <w:color w:val="000000"/>
-          <w:sz w:val="24"/>
-        </w:rPr>
-        <w:t>Cross-references database timestamps with low-level OS stat attributes (ctime, mtime, atime) across the host storage staging tier to uncover unauthorized out-of-band administrative tampering.</w:t>
+          <w:sz w:val="24"/>
+        </w:rPr>
+        <w:t xml:space="preserve">Local Host Filesystem </w:t>
+      </w:r>
+      <w:proofErr w:type="spellStart"/>
+      <w:r>
+        <w:rPr>
+          <w:rFonts w:ascii="Times New Roman" w:hAnsi="Times New Roman"/>
+          <w:b/>
+          <w:sz w:val="24"/>
+        </w:rPr>
+        <w:t>Inode</w:t>
+      </w:r>
+      <w:proofErr w:type="spellEnd"/>
+      <w:r>
+        <w:rPr>
+          <w:rFonts w:ascii="Times New Roman" w:hAnsi="Times New Roman"/>
+          <w:b/>
+          <w:sz w:val="24"/>
+        </w:rPr>
+        <w:t xml:space="preserve"> &amp; Metadata Auditing: </w:t>
+      </w:r>
+      <w:r>
+        <w:rPr>
+          <w:rFonts w:ascii="Times New Roman" w:hAnsi="Times New Roman"/>
+          <w:sz w:val="24"/>
+        </w:rPr>
+        <w:t>Cross-references database timestamps with low-level OS stat attributes (</w:t>
+      </w:r>
+      <w:proofErr w:type="spellStart"/>
+      <w:r>
+        <w:rPr>
+          <w:rFonts w:ascii="Times New Roman" w:hAnsi="Times New Roman"/>
+          <w:sz w:val="24"/>
+        </w:rPr>
+        <w:t>ctime</w:t>
+      </w:r>
+      <w:proofErr w:type="spellEnd"/>
+      <w:r>
+        <w:rPr>
+          <w:rFonts w:ascii="Times New Roman" w:hAnsi="Times New Roman"/>
+          <w:sz w:val="24"/>
+        </w:rPr>
+        <w:t xml:space="preserve">, </w:t>
+      </w:r>
+      <w:proofErr w:type="spellStart"/>
+      <w:r>
+        <w:rPr>
+          <w:rFonts w:ascii="Times New Roman" w:hAnsi="Times New Roman"/>
+          <w:sz w:val="24"/>
+        </w:rPr>
+        <w:t>mtime</w:t>
+      </w:r>
+      <w:proofErr w:type="spellEnd"/>
+      <w:r>
+        <w:rPr>
+          <w:rFonts w:ascii="Times New Roman" w:hAnsi="Times New Roman"/>
+          <w:sz w:val="24"/>
+        </w:rPr>
+        <w:t xml:space="preserve">, </w:t>
+      </w:r>
+      <w:proofErr w:type="spellStart"/>
+      <w:r>
+        <w:rPr>
+          <w:rFonts w:ascii="Times New Roman" w:hAnsi="Times New Roman"/>
+          <w:sz w:val="24"/>
+        </w:rPr>
+        <w:t>atime</w:t>
+      </w:r>
+      <w:proofErr w:type="spellEnd"/>
+      <w:r>
+        <w:rPr>
+          <w:rFonts w:ascii="Times New Roman" w:hAnsi="Times New Roman"/>
+          <w:sz w:val="24"/>
+        </w:rPr>
+        <w:t>) across the host storage staging tier to uncover unauthorized out-of-band administrative tampering.</w:t>
       </w:r>
     </w:p>
     <w:p>
@@ -1151,21 +1278,13 @@
         <w:tabs>
           <w:tab w:val="num" w:pos="360"/>
         </w:tabs>
-        <w:spacing w:before="40" w:line="360" w:lineRule="auto" w:after="80"/>
+        <w:spacing w:before="40" w:line="360" w:lineRule="auto"/>
         <w:ind w:left="360" w:hanging="360"/>
       </w:pPr>
       <w:r>
         <w:rPr>
           <w:rFonts w:ascii="Times New Roman" w:hAnsi="Times New Roman"/>
-          <w:color w:val="000000"/>
-          <w:sz w:val="24"/>
-        </w:rPr>
-      </w:r>
-      <w:r>
-        <w:rPr>
-          <w:rFonts w:ascii="Times New Roman" w:hAnsi="Times New Roman"/>
           <w:b/>
-          <w:color w:val="000000"/>
           <w:sz w:val="24"/>
         </w:rPr>
         <w:t xml:space="preserve">Security Audit Event Logger: </w:t>
@@ -1173,7 +1292,6 @@
       <w:r>
         <w:rPr>
           <w:rFonts w:ascii="Times New Roman" w:hAnsi="Times New Roman"/>
-          <w:color w:val="000000"/>
           <w:sz w:val="24"/>
         </w:rPr>
         <w:t>Records events across five severity tiers (INFO, LOW, MEDIUM, HIGH, CRITICAL) and four outcomes (SUCCESS, BLOCKED, WARNING, FAILURE) with client IP telemetry.</w:t>
@@ -1183,7 +1301,6 @@
       <w:pPr>
         <w:keepNext/>
         <w:spacing w:before="280" w:after="80" w:line="276" w:lineRule="auto"/>
-        <w:jc w:val="left"/>
       </w:pPr>
       <w:r>
         <w:rPr>
@@ -1201,21 +1318,13 @@
         <w:tabs>
           <w:tab w:val="num" w:pos="360"/>
         </w:tabs>
-        <w:spacing w:before="40" w:line="360" w:lineRule="auto" w:after="80"/>
+        <w:spacing w:before="40" w:line="360" w:lineRule="auto"/>
         <w:ind w:left="360" w:hanging="360"/>
       </w:pPr>
       <w:r>
         <w:rPr>
           <w:rFonts w:ascii="Times New Roman" w:hAnsi="Times New Roman"/>
-          <w:color w:val="000000"/>
-          <w:sz w:val="24"/>
-        </w:rPr>
-      </w:r>
-      <w:r>
-        <w:rPr>
-          <w:rFonts w:ascii="Times New Roman" w:hAnsi="Times New Roman"/>
           <w:b/>
-          <w:color w:val="000000"/>
           <w:sz w:val="24"/>
         </w:rPr>
         <w:t xml:space="preserve">Multi-Threaded S3 Multipart Transfers: </w:t>
@@ -1223,10 +1332,25 @@
       <w:r>
         <w:rPr>
           <w:rFonts w:ascii="Times New Roman" w:hAnsi="Times New Roman"/>
-          <w:color w:val="000000"/>
-          <w:sz w:val="24"/>
-        </w:rPr>
-        <w:t>Configured boto3 TransferConfig with 10 parallel threads and 256 KB memory buffers, drastically reducing latency for large document packages and video files.</w:t>
+          <w:sz w:val="24"/>
+        </w:rPr>
+        <w:t xml:space="preserve">Configured boto3 </w:t>
+      </w:r>
+      <w:proofErr w:type="spellStart"/>
+      <w:r>
+        <w:rPr>
+          <w:rFonts w:ascii="Times New Roman" w:hAnsi="Times New Roman"/>
+          <w:sz w:val="24"/>
+        </w:rPr>
+        <w:t>TransferConfig</w:t>
+      </w:r>
+      <w:proofErr w:type="spellEnd"/>
+      <w:r>
+        <w:rPr>
+          <w:rFonts w:ascii="Times New Roman" w:hAnsi="Times New Roman"/>
+          <w:sz w:val="24"/>
+        </w:rPr>
+        <w:t xml:space="preserve"> with 10 parallel threads and 256 KB memory buffers, drastically reducing latency for large document packages and video files.</w:t>
       </w:r>
     </w:p>
     <w:p>
@@ -1235,21 +1359,13 @@
         <w:tabs>
           <w:tab w:val="num" w:pos="360"/>
         </w:tabs>
-        <w:spacing w:before="40" w:line="360" w:lineRule="auto" w:after="80"/>
+        <w:spacing w:before="40" w:line="360" w:lineRule="auto"/>
         <w:ind w:left="360" w:hanging="360"/>
       </w:pPr>
       <w:r>
         <w:rPr>
           <w:rFonts w:ascii="Times New Roman" w:hAnsi="Times New Roman"/>
-          <w:color w:val="000000"/>
-          <w:sz w:val="24"/>
-        </w:rPr>
-      </w:r>
-      <w:r>
-        <w:rPr>
-          <w:rFonts w:ascii="Times New Roman" w:hAnsi="Times New Roman"/>
           <w:b/>
-          <w:color w:val="000000"/>
           <w:sz w:val="24"/>
         </w:rPr>
         <w:t xml:space="preserve">10 GB Capacity Monitor &amp; 90% Threshold Alert: </w:t>
@@ -1257,10 +1373,25 @@
       <w:r>
         <w:rPr>
           <w:rFonts w:ascii="Times New Roman" w:hAnsi="Times New Roman"/>
-          <w:color w:val="000000"/>
-          <w:sz w:val="24"/>
-        </w:rPr>
-        <w:t>Continuously tallies active storage consumption against Backblaze B2 bucket limits, displaying real-time metrics and an automated 7-day usage trajectory chart.</w:t>
+          <w:sz w:val="24"/>
+        </w:rPr>
+        <w:t xml:space="preserve">Continuously tallies active storage consumption against </w:t>
+      </w:r>
+      <w:proofErr w:type="spellStart"/>
+      <w:r>
+        <w:rPr>
+          <w:rFonts w:ascii="Times New Roman" w:hAnsi="Times New Roman"/>
+          <w:sz w:val="24"/>
+        </w:rPr>
+        <w:t>Backblaze</w:t>
+      </w:r>
+      <w:proofErr w:type="spellEnd"/>
+      <w:r>
+        <w:rPr>
+          <w:rFonts w:ascii="Times New Roman" w:hAnsi="Times New Roman"/>
+          <w:sz w:val="24"/>
+        </w:rPr>
+        <w:t xml:space="preserve"> B2 bucket limits, displaying real-time metrics and an automated 7-day usage trajectory chart.</w:t>
       </w:r>
     </w:p>
     <w:p>
@@ -1269,21 +1400,13 @@
         <w:tabs>
           <w:tab w:val="num" w:pos="360"/>
         </w:tabs>
-        <w:spacing w:before="40" w:line="360" w:lineRule="auto" w:after="80"/>
+        <w:spacing w:before="40" w:line="360" w:lineRule="auto"/>
         <w:ind w:left="360" w:hanging="360"/>
       </w:pPr>
       <w:r>
         <w:rPr>
           <w:rFonts w:ascii="Times New Roman" w:hAnsi="Times New Roman"/>
-          <w:color w:val="000000"/>
-          <w:sz w:val="24"/>
-        </w:rPr>
-      </w:r>
-      <w:r>
-        <w:rPr>
-          <w:rFonts w:ascii="Times New Roman" w:hAnsi="Times New Roman"/>
           <w:b/>
-          <w:color w:val="000000"/>
           <w:sz w:val="24"/>
         </w:rPr>
         <w:t xml:space="preserve">Automated Conditional Schema Migrations: </w:t>
@@ -1291,7 +1414,6 @@
       <w:r>
         <w:rPr>
           <w:rFonts w:ascii="Times New Roman" w:hAnsi="Times New Roman"/>
-          <w:color w:val="000000"/>
           <w:sz w:val="24"/>
         </w:rPr>
         <w:t>Embedded DDL migration handlers dynamically apply schema adjustments during deployment cycles, preventing schema drift on serverless PostgreSQL.</w:t>
@@ -1301,7 +1423,6 @@
       <w:pPr>
         <w:keepNext/>
         <w:spacing w:before="280" w:after="80" w:line="276" w:lineRule="auto"/>
-        <w:jc w:val="left"/>
       </w:pPr>
       <w:r>
         <w:rPr>
@@ -1319,32 +1440,89 @@
         <w:tabs>
           <w:tab w:val="num" w:pos="360"/>
         </w:tabs>
-        <w:spacing w:before="40" w:line="360" w:lineRule="auto" w:after="80"/>
+        <w:spacing w:before="40" w:line="360" w:lineRule="auto"/>
         <w:ind w:left="360" w:hanging="360"/>
       </w:pPr>
       <w:r>
         <w:rPr>
           <w:rFonts w:ascii="Times New Roman" w:hAnsi="Times New Roman"/>
-          <w:color w:val="000000"/>
-          <w:sz w:val="24"/>
-        </w:rPr>
-      </w:r>
-      <w:r>
-        <w:rPr>
-          <w:rFonts w:ascii="Times New Roman" w:hAnsi="Times New Roman"/>
           <w:b/>
-          <w:color w:val="000000"/>
-          <w:sz w:val="24"/>
-        </w:rPr>
-        <w:t xml:space="preserve">Dual-Tab LocalStorage Vault (/history): </w:t>
-      </w:r>
-      <w:r>
-        <w:rPr>
-          <w:rFonts w:ascii="Times New Roman" w:hAnsi="Times New Roman"/>
-          <w:color w:val="000000"/>
-          <w:sz w:val="24"/>
-        </w:rPr>
-        <w:t>Records 'Uploaded By Me' and 'Shared With Me' directly in client-side localStorage. No user accounts, passwords, or personal profiling exist on the server.</w:t>
+          <w:sz w:val="24"/>
+        </w:rPr>
+        <w:t xml:space="preserve">Dual-Tab </w:t>
+      </w:r>
+      <w:proofErr w:type="spellStart"/>
+      <w:r>
+        <w:rPr>
+          <w:rFonts w:ascii="Times New Roman" w:hAnsi="Times New Roman"/>
+          <w:b/>
+          <w:sz w:val="24"/>
+        </w:rPr>
+        <w:t>LocalStorage</w:t>
+      </w:r>
+      <w:proofErr w:type="spellEnd"/>
+      <w:r>
+        <w:rPr>
+          <w:rFonts w:ascii="Times New Roman" w:hAnsi="Times New Roman"/>
+          <w:b/>
+          <w:sz w:val="24"/>
+        </w:rPr>
+        <w:t xml:space="preserve"> Vault (/history): </w:t>
+      </w:r>
+      <w:r>
+        <w:rPr>
+          <w:rFonts w:ascii="Times New Roman" w:hAnsi="Times New Roman"/>
+          <w:sz w:val="24"/>
+        </w:rPr>
+        <w:t xml:space="preserve">Records 'Uploaded </w:t>
+      </w:r>
+      <w:proofErr w:type="gramStart"/>
+      <w:r>
+        <w:rPr>
+          <w:rFonts w:ascii="Times New Roman" w:hAnsi="Times New Roman"/>
+          <w:sz w:val="24"/>
+        </w:rPr>
+        <w:t>By</w:t>
+      </w:r>
+      <w:proofErr w:type="gramEnd"/>
+      <w:r>
+        <w:rPr>
+          <w:rFonts w:ascii="Times New Roman" w:hAnsi="Times New Roman"/>
+          <w:sz w:val="24"/>
+        </w:rPr>
+        <w:t xml:space="preserve"> Me' and 'Shared </w:t>
+      </w:r>
+      <w:proofErr w:type="gramStart"/>
+      <w:r>
+        <w:rPr>
+          <w:rFonts w:ascii="Times New Roman" w:hAnsi="Times New Roman"/>
+          <w:sz w:val="24"/>
+        </w:rPr>
+        <w:t>With</w:t>
+      </w:r>
+      <w:proofErr w:type="gramEnd"/>
+      <w:r>
+        <w:rPr>
+          <w:rFonts w:ascii="Times New Roman" w:hAnsi="Times New Roman"/>
+          <w:sz w:val="24"/>
+        </w:rPr>
+        <w:t xml:space="preserve"> Me' directly in client-side </w:t>
+      </w:r>
+      <w:proofErr w:type="spellStart"/>
+      <w:r>
+        <w:rPr>
+          <w:rFonts w:ascii="Times New Roman" w:hAnsi="Times New Roman"/>
+          <w:sz w:val="24"/>
+        </w:rPr>
+        <w:t>localStorage</w:t>
+      </w:r>
+      <w:proofErr w:type="spellEnd"/>
+      <w:r>
+        <w:rPr>
+          <w:rFonts w:ascii="Times New Roman" w:hAnsi="Times New Roman"/>
+          <w:sz w:val="24"/>
+        </w:rPr>
+        <w:t>. No user accounts, passwords, or personal profiling exist on the server.</w:t>
       </w:r>
     </w:p>
     <w:p>
@@ -1353,29 +1531,38 @@
         <w:tabs>
           <w:tab w:val="num" w:pos="360"/>
         </w:tabs>
-        <w:spacing w:before="40" w:line="360" w:lineRule="auto" w:after="80"/>
+        <w:spacing w:before="40" w:line="360" w:lineRule="auto"/>
         <w:ind w:left="360" w:hanging="360"/>
       </w:pPr>
       <w:r>
         <w:rPr>
           <w:rFonts w:ascii="Times New Roman" w:hAnsi="Times New Roman"/>
-          <w:color w:val="000000"/>
-          <w:sz w:val="24"/>
-        </w:rPr>
-      </w:r>
-      <w:r>
-        <w:rPr>
-          <w:rFonts w:ascii="Times New Roman" w:hAnsi="Times New Roman"/>
           <w:b/>
-          <w:color w:val="000000"/>
-          <w:sz w:val="24"/>
-        </w:rPr>
-        <w:t xml:space="preserve">Live Batch Status Synchronization (/api/files/batch-status): </w:t>
-      </w:r>
-      <w:r>
-        <w:rPr>
-          <w:rFonts w:ascii="Times New Roman" w:hAnsi="Times New Roman"/>
-          <w:color w:val="000000"/>
+          <w:sz w:val="24"/>
+        </w:rPr>
+        <w:t>Live Batch Status Synchronization (/</w:t>
+      </w:r>
+      <w:proofErr w:type="spellStart"/>
+      <w:r>
+        <w:rPr>
+          <w:rFonts w:ascii="Times New Roman" w:hAnsi="Times New Roman"/>
+          <w:b/>
+          <w:sz w:val="24"/>
+        </w:rPr>
+        <w:t>api</w:t>
+      </w:r>
+      <w:proofErr w:type="spellEnd"/>
+      <w:r>
+        <w:rPr>
+          <w:rFonts w:ascii="Times New Roman" w:hAnsi="Times New Roman"/>
+          <w:b/>
+          <w:sz w:val="24"/>
+        </w:rPr>
+        <w:t xml:space="preserve">/files/batch-status): </w:t>
+      </w:r>
+      <w:r>
+        <w:rPr>
+          <w:rFonts w:ascii="Times New Roman" w:hAnsi="Times New Roman"/>
           <w:sz w:val="24"/>
         </w:rPr>
         <w:t>Queries up to 50 local tokens in a single JSON payload to update live status badges (Active, Expired, Revoked) and 1-second countdown tickers.</w:t>
@@ -1387,21 +1574,13 @@
         <w:tabs>
           <w:tab w:val="num" w:pos="360"/>
         </w:tabs>
-        <w:spacing w:before="40" w:line="360" w:lineRule="auto" w:after="80"/>
+        <w:spacing w:before="40" w:line="360" w:lineRule="auto"/>
         <w:ind w:left="360" w:hanging="360"/>
       </w:pPr>
       <w:r>
         <w:rPr>
           <w:rFonts w:ascii="Times New Roman" w:hAnsi="Times New Roman"/>
-          <w:color w:val="000000"/>
-          <w:sz w:val="24"/>
-        </w:rPr>
-      </w:r>
-      <w:r>
-        <w:rPr>
-          <w:rFonts w:ascii="Times New Roman" w:hAnsi="Times New Roman"/>
           <w:b/>
-          <w:color w:val="000000"/>
           <w:sz w:val="24"/>
         </w:rPr>
         <w:t xml:space="preserve">1-Click Early Remote Revocation: </w:t>
@@ -1409,17 +1588,31 @@
       <w:r>
         <w:rPr>
           <w:rFonts w:ascii="Times New Roman" w:hAnsi="Times New Roman"/>
-          <w:color w:val="000000"/>
-          <w:sz w:val="24"/>
-        </w:rPr>
-        <w:t>Uploaders can immediately purge their active files from Backblaze B2 ahead of the 12-hour deadline, instantly invalidating the link.</w:t>
+          <w:sz w:val="24"/>
+        </w:rPr>
+        <w:t xml:space="preserve">Uploaders can immediately purge their active files from </w:t>
+      </w:r>
+      <w:proofErr w:type="spellStart"/>
+      <w:r>
+        <w:rPr>
+          <w:rFonts w:ascii="Times New Roman" w:hAnsi="Times New Roman"/>
+          <w:sz w:val="24"/>
+        </w:rPr>
+        <w:t>Backblaze</w:t>
+      </w:r>
+      <w:proofErr w:type="spellEnd"/>
+      <w:r>
+        <w:rPr>
+          <w:rFonts w:ascii="Times New Roman" w:hAnsi="Times New Roman"/>
+          <w:sz w:val="24"/>
+        </w:rPr>
+        <w:t xml:space="preserve"> B2 ahead of the 12-hour deadline, instantly invalidating the link.</w:t>
       </w:r>
     </w:p>
     <w:p>
       <w:pPr>
         <w:keepNext/>
         <w:spacing w:before="280" w:after="80" w:line="276" w:lineRule="auto"/>
-        <w:jc w:val="left"/>
       </w:pPr>
       <w:r>
         <w:rPr>
@@ -1433,17 +1626,51 @@
     </w:p>
     <w:p>
       <w:pPr>
-        <w:spacing w:after="120" w:line="360" w:lineRule="auto" w:before="0"/>
+        <w:spacing w:after="120" w:line="360" w:lineRule="auto"/>
         <w:jc w:val="both"/>
-      </w:pPr>
-      <w:r>
         <w:rPr>
           <w:rFonts w:ascii="Times New Roman" w:hAnsi="Times New Roman"/>
           <w:color w:val="000000"/>
-          <w:sz w:val="24"/>
-        </w:rPr>
-        <w:t>FileGuard was validated with an automated Pytest test suite of 48 test cases covering functional, cryptographic integrity, security penetration (OWASP WSTG v4.2), and SEO domains (100% pass rate):</w:t>
-      </w:r>
+        </w:rPr>
+      </w:pPr>
+      <w:proofErr w:type="spellStart"/>
+      <w:r>
+        <w:rPr>
+          <w:rFonts w:ascii="Times New Roman" w:hAnsi="Times New Roman"/>
+          <w:color w:val="000000"/>
+        </w:rPr>
+        <w:t>FileGuard</w:t>
+      </w:r>
+      <w:proofErr w:type="spellEnd"/>
+      <w:r>
+        <w:rPr>
+          <w:rFonts w:ascii="Times New Roman" w:hAnsi="Times New Roman"/>
+          <w:color w:val="000000"/>
+        </w:rPr>
+        <w:t xml:space="preserve"> was validated with an automated </w:t>
+      </w:r>
+      <w:proofErr w:type="spellStart"/>
+      <w:r>
+        <w:rPr>
+          <w:rFonts w:ascii="Times New Roman" w:hAnsi="Times New Roman"/>
+          <w:color w:val="000000"/>
+        </w:rPr>
+        <w:t>Pytest</w:t>
+      </w:r>
+      <w:proofErr w:type="spellEnd"/>
+      <w:r>
+        <w:rPr>
+          <w:rFonts w:ascii="Times New Roman" w:hAnsi="Times New Roman"/>
+          <w:color w:val="000000"/>
+        </w:rPr>
+        <w:t xml:space="preserve"> test suite of 48 test cases covering functional, cryptographic integrity, security penetration (OWASP WSTG v4.2), and SEO domains (100% pass rate):</w:t>
+      </w:r>
+    </w:p>
+    <w:p>
+      <w:pPr>
+        <w:spacing w:after="120" w:line="360" w:lineRule="auto"/>
+        <w:jc w:val="both"/>
+      </w:pPr>
     </w:p>
     <w:tbl>
       <w:tblPr>
@@ -1452,9 +1679,9 @@
         <w:tblLook w:val="04A0" w:firstRow="1" w:lastRow="0" w:firstColumn="1" w:lastColumn="0" w:noHBand="0" w:noVBand="1"/>
       </w:tblPr>
       <w:tblGrid>
-        <w:gridCol w:w="2938"/>
-        <w:gridCol w:w="3331"/>
-        <w:gridCol w:w="3091"/>
+        <w:gridCol w:w="3346"/>
+        <w:gridCol w:w="3870"/>
+        <w:gridCol w:w="3584"/>
       </w:tblGrid>
       <w:tr>
         <w:trPr>
@@ -1482,6 +1709,7 @@
                 <w:color w:val="FFFFFF"/>
                 <w:sz w:val="20"/>
               </w:rPr>
+              <w:lastRenderedPageBreak/>
               <w:t>Testing Domain</w:t>
             </w:r>
           </w:p>
@@ -1556,7 +1784,7 @@
           </w:tcPr>
           <w:p>
             <w:pPr>
-              <w:spacing w:line="276" w:lineRule="auto" w:after="40"/>
+              <w:spacing w:after="40" w:line="276" w:lineRule="auto"/>
             </w:pPr>
             <w:r>
               <w:rPr>
@@ -1581,7 +1809,7 @@
           </w:tcPr>
           <w:p>
             <w:pPr>
-              <w:spacing w:line="276" w:lineRule="auto" w:after="40"/>
+              <w:spacing w:after="40" w:line="276" w:lineRule="auto"/>
             </w:pPr>
             <w:r>
               <w:rPr>
@@ -1606,7 +1834,7 @@
           </w:tcPr>
           <w:p>
             <w:pPr>
-              <w:spacing w:line="276" w:lineRule="auto" w:after="40"/>
+              <w:spacing w:after="40" w:line="276" w:lineRule="auto"/>
             </w:pPr>
             <w:r>
               <w:rPr>
@@ -1636,7 +1864,7 @@
           </w:tcPr>
           <w:p>
             <w:pPr>
-              <w:spacing w:line="276" w:lineRule="auto" w:after="40"/>
+              <w:spacing w:after="40" w:line="276" w:lineRule="auto"/>
             </w:pPr>
             <w:r>
               <w:rPr>
@@ -1661,7 +1889,7 @@
           </w:tcPr>
           <w:p>
             <w:pPr>
-              <w:spacing w:line="276" w:lineRule="auto" w:after="40"/>
+              <w:spacing w:after="40" w:line="276" w:lineRule="auto"/>
             </w:pPr>
             <w:r>
               <w:rPr>
@@ -1686,7 +1914,7 @@
           </w:tcPr>
           <w:p>
             <w:pPr>
-              <w:spacing w:line="276" w:lineRule="auto" w:after="40"/>
+              <w:spacing w:after="40" w:line="276" w:lineRule="auto"/>
             </w:pPr>
             <w:r>
               <w:rPr>
@@ -1716,7 +1944,7 @@
           </w:tcPr>
           <w:p>
             <w:pPr>
-              <w:spacing w:line="276" w:lineRule="auto" w:after="40"/>
+              <w:spacing w:after="40" w:line="276" w:lineRule="auto"/>
             </w:pPr>
             <w:r>
               <w:rPr>
@@ -1741,7 +1969,7 @@
           </w:tcPr>
           <w:p>
             <w:pPr>
-              <w:spacing w:line="276" w:lineRule="auto" w:after="40"/>
+              <w:spacing w:after="40" w:line="276" w:lineRule="auto"/>
             </w:pPr>
             <w:r>
               <w:rPr>
@@ -1766,7 +1994,7 @@
           </w:tcPr>
           <w:p>
             <w:pPr>
-              <w:spacing w:line="276" w:lineRule="auto" w:after="40"/>
+              <w:spacing w:after="40" w:line="276" w:lineRule="auto"/>
             </w:pPr>
             <w:r>
               <w:rPr>
@@ -1796,7 +2024,7 @@
           </w:tcPr>
           <w:p>
             <w:pPr>
-              <w:spacing w:line="276" w:lineRule="auto" w:after="40"/>
+              <w:spacing w:after="40" w:line="276" w:lineRule="auto"/>
             </w:pPr>
             <w:r>
               <w:rPr>
@@ -1821,7 +2049,7 @@
           </w:tcPr>
           <w:p>
             <w:pPr>
-              <w:spacing w:line="276" w:lineRule="auto" w:after="40"/>
+              <w:spacing w:after="40" w:line="276" w:lineRule="auto"/>
             </w:pPr>
             <w:r>
               <w:rPr>
@@ -1846,7 +2074,7 @@
           </w:tcPr>
           <w:p>
             <w:pPr>
-              <w:spacing w:line="276" w:lineRule="auto" w:after="40"/>
+              <w:spacing w:after="40" w:line="276" w:lineRule="auto"/>
             </w:pPr>
             <w:r>
               <w:rPr>
@@ -1862,14 +2090,13 @@
     </w:tbl>
     <w:p>
       <w:pPr>
-        <w:spacing w:after="40" w:before="0"/>
+        <w:spacing w:after="40"/>
       </w:pPr>
     </w:p>
     <w:p>
       <w:pPr>
         <w:keepNext/>
         <w:spacing w:before="240" w:after="60" w:line="276" w:lineRule="auto"/>
-        <w:jc w:val="left"/>
       </w:pPr>
       <w:r>
         <w:rPr>
@@ -1887,21 +2114,13 @@
         <w:tabs>
           <w:tab w:val="num" w:pos="360"/>
         </w:tabs>
-        <w:spacing w:before="40" w:line="360" w:lineRule="auto" w:after="80"/>
+        <w:spacing w:before="40" w:line="360" w:lineRule="auto"/>
         <w:ind w:left="360" w:hanging="360"/>
       </w:pPr>
       <w:r>
         <w:rPr>
           <w:rFonts w:ascii="Times New Roman" w:hAnsi="Times New Roman"/>
-          <w:color w:val="000000"/>
-          <w:sz w:val="24"/>
-        </w:rPr>
-      </w:r>
-      <w:r>
-        <w:rPr>
-          <w:rFonts w:ascii="Times New Roman" w:hAnsi="Times New Roman"/>
           <w:b/>
-          <w:color w:val="000000"/>
           <w:sz w:val="24"/>
         </w:rPr>
         <w:t xml:space="preserve">Aditya Abhijit (Student ID: 245811404): </w:t>
@@ -1909,10 +2128,25 @@
       <w:r>
         <w:rPr>
           <w:rFonts w:ascii="Times New Roman" w:hAnsi="Times New Roman"/>
-          <w:color w:val="000000"/>
-          <w:sz w:val="24"/>
-        </w:rPr>
-        <w:t>Engineered the SHA-256 cryptographic pre-flight verification pipeline; built the OS filesystem inode metadata auditing module; created the interactive bit-flip tampering simulator; designed the structured security audit event logger; developed automated test suites for file tampering and missing file detection.</w:t>
+          <w:sz w:val="24"/>
+        </w:rPr>
+        <w:t xml:space="preserve">Engineered the SHA-256 cryptographic pre-flight verification pipeline; built the OS filesystem </w:t>
+      </w:r>
+      <w:proofErr w:type="spellStart"/>
+      <w:r>
+        <w:rPr>
+          <w:rFonts w:ascii="Times New Roman" w:hAnsi="Times New Roman"/>
+          <w:sz w:val="24"/>
+        </w:rPr>
+        <w:t>inode</w:t>
+      </w:r>
+      <w:proofErr w:type="spellEnd"/>
+      <w:r>
+        <w:rPr>
+          <w:rFonts w:ascii="Times New Roman" w:hAnsi="Times New Roman"/>
+          <w:sz w:val="24"/>
+        </w:rPr>
+        <w:t xml:space="preserve"> metadata auditing module; created the interactive bit-flip tampering simulator; designed the structured security audit event logger; developed automated test suites for file tampering and missing file detection.</w:t>
       </w:r>
     </w:p>
     <w:p>
@@ -1921,21 +2155,13 @@
         <w:tabs>
           <w:tab w:val="num" w:pos="360"/>
         </w:tabs>
-        <w:spacing w:before="40" w:line="360" w:lineRule="auto" w:after="80"/>
+        <w:spacing w:before="40" w:line="360" w:lineRule="auto"/>
         <w:ind w:left="360" w:hanging="360"/>
       </w:pPr>
       <w:r>
         <w:rPr>
           <w:rFonts w:ascii="Times New Roman" w:hAnsi="Times New Roman"/>
-          <w:color w:val="000000"/>
-          <w:sz w:val="24"/>
-        </w:rPr>
-      </w:r>
-      <w:r>
-        <w:rPr>
-          <w:rFonts w:ascii="Times New Roman" w:hAnsi="Times New Roman"/>
           <w:b/>
-          <w:color w:val="000000"/>
           <w:sz w:val="24"/>
         </w:rPr>
         <w:t xml:space="preserve">Deeptanil Sinha (Student ID: 245811402): </w:t>
@@ -1943,17 +2169,47 @@
       <w:r>
         <w:rPr>
           <w:rFonts w:ascii="Times New Roman" w:hAnsi="Times New Roman"/>
-          <w:color w:val="000000"/>
-          <w:sz w:val="24"/>
-        </w:rPr>
-        <w:t>Designed the end-to-end full-stack architecture and Neo-Brutalist UI; engineered the in-memory streaming ZIP packager for folder uploads; implemented client-IP quota controls; integrated Neon Serverless PostgreSQL and Backblaze B2 S3 multipart transfers; developed the client-side localStorage vault with batch status synchronization.</w:t>
+          <w:sz w:val="24"/>
+        </w:rPr>
+        <w:t xml:space="preserve">Designed the end-to-end full-stack architecture and Neo-Brutalist UI; engineered the in-memory streaming ZIP packager for folder uploads; implemented client-IP quota controls; integrated Neon Serverless PostgreSQL and </w:t>
+      </w:r>
+      <w:proofErr w:type="spellStart"/>
+      <w:r>
+        <w:rPr>
+          <w:rFonts w:ascii="Times New Roman" w:hAnsi="Times New Roman"/>
+          <w:sz w:val="24"/>
+        </w:rPr>
+        <w:t>Backblaze</w:t>
+      </w:r>
+      <w:proofErr w:type="spellEnd"/>
+      <w:r>
+        <w:rPr>
+          <w:rFonts w:ascii="Times New Roman" w:hAnsi="Times New Roman"/>
+          <w:sz w:val="24"/>
+        </w:rPr>
+        <w:t xml:space="preserve"> B2 S3 multipart transfers; developed the client-side </w:t>
+      </w:r>
+      <w:proofErr w:type="spellStart"/>
+      <w:r>
+        <w:rPr>
+          <w:rFonts w:ascii="Times New Roman" w:hAnsi="Times New Roman"/>
+          <w:sz w:val="24"/>
+        </w:rPr>
+        <w:t>localStorage</w:t>
+      </w:r>
+      <w:proofErr w:type="spellEnd"/>
+      <w:r>
+        <w:rPr>
+          <w:rFonts w:ascii="Times New Roman" w:hAnsi="Times New Roman"/>
+          <w:sz w:val="24"/>
+        </w:rPr>
+        <w:t xml:space="preserve"> vault with batch status synchronization.</w:t>
       </w:r>
     </w:p>
     <w:p>
       <w:pPr>
         <w:keepNext/>
         <w:spacing w:before="280" w:after="80" w:line="276" w:lineRule="auto"/>
-        <w:jc w:val="left"/>
       </w:pPr>
       <w:r>
         <w:rPr>
@@ -1967,21 +2223,45 @@
     </w:p>
     <w:p>
       <w:pPr>
-        <w:spacing w:after="120" w:line="360" w:lineRule="auto" w:before="0"/>
+        <w:spacing w:after="120" w:line="360" w:lineRule="auto"/>
         <w:jc w:val="both"/>
       </w:pPr>
+      <w:proofErr w:type="spellStart"/>
       <w:r>
         <w:rPr>
           <w:rFonts w:ascii="Times New Roman" w:hAnsi="Times New Roman"/>
           <w:color w:val="000000"/>
-          <w:sz w:val="24"/>
-        </w:rPr>
-        <w:t>FileGuard demonstrates that temporary file sharing can achieve robust security without sacrificing user convenience or privacy. By coupling strict 12-hour automated purging, transparent AES-256-GCM encryption at rest, in-memory folder compression, pre-flight cryptographic validation, and anonymous client-side vaults, FileGuard provides a resilient reference implementation for Information &amp; Network Security. A live preview can be inspected at: https://files.deeptanil.in</w:t>
+        </w:rPr>
+        <w:t>FileGuard</w:t>
+      </w:r>
+      <w:proofErr w:type="spellEnd"/>
+      <w:r>
+        <w:rPr>
+          <w:rFonts w:ascii="Times New Roman" w:hAnsi="Times New Roman"/>
+          <w:color w:val="000000"/>
+        </w:rPr>
+        <w:t xml:space="preserve"> demonstrates that temporary file sharing can achieve robust security without sacrificing user convenience or privacy. By coupling strict 12-hour automated purging, transparent AES-256-GCM encryption at rest, in-memory folder compression, pre-flight cryptographic validation, and anonymous client-side vaults, </w:t>
+      </w:r>
+      <w:proofErr w:type="spellStart"/>
+      <w:r>
+        <w:rPr>
+          <w:rFonts w:ascii="Times New Roman" w:hAnsi="Times New Roman"/>
+          <w:color w:val="000000"/>
+        </w:rPr>
+        <w:t>FileGuard</w:t>
+      </w:r>
+      <w:proofErr w:type="spellEnd"/>
+      <w:r>
+        <w:rPr>
+          <w:rFonts w:ascii="Times New Roman" w:hAnsi="Times New Roman"/>
+          <w:color w:val="000000"/>
+        </w:rPr>
+        <w:t xml:space="preserve"> provides a resilient reference implementation for Information &amp; Network Security. A live preview can be inspected at: https://files.deeptanil.in</w:t>
       </w:r>
     </w:p>
     <w:sectPr>
       <w:pgSz w:w="12240" w:h="15840"/>
-      <w:pgMar w:top="1440" w:right="1440" w:bottom="1440" w:left="1440" w:header="720" w:footer="720" w:gutter="0"/>
+      <w:pgMar w:top="720" w:right="720" w:bottom="720" w:left="720" w:header="720" w:footer="720" w:gutter="0"/>
       <w:cols w:space="720"/>
       <w:docGrid w:linePitch="360"/>
     </w:sectPr>
@@ -3280,6 +3560,21 @@
 </file>
 
 <file path=customXml/item1.xml><?xml version="1.0" encoding="utf-8"?>
+<p:properties xmlns:p="http://schemas.microsoft.com/office/2006/metadata/properties" xmlns:xsi="http://www.w3.org/2001/XMLSchema-instance" xmlns:pc="http://schemas.microsoft.com/office/infopath/2007/PartnerControls">
+  <documentManagement/>
+</p:properties>
+</file>
+
+<file path=customXml/item2.xml><?xml version="1.0" encoding="utf-8"?>
+<?mso-contentType ?>
+<FormTemplates xmlns="http://schemas.microsoft.com/sharepoint/v3/contenttype/forms">
+  <Display>DocumentLibraryForm</Display>
+  <Edit>DocumentLibraryForm</Edit>
+  <New>DocumentLibraryForm</New>
+</FormTemplates>
+</file>
+
+<file path=customXml/item3.xml><?xml version="1.0" encoding="utf-8"?>
 <ct:contentTypeSchema xmlns:ct="http://schemas.microsoft.com/office/2006/metadata/contentType" xmlns:ma="http://schemas.microsoft.com/office/2006/metadata/properties/metaAttributes" ct:_="" ma:_="" ma:contentTypeName="Document" ma:contentTypeID="0x0101001E165DD21DB56E4689C1434186F30BF9" ma:contentTypeVersion="3" ma:contentTypeDescription="Create a new document." ma:contentTypeScope="" ma:versionID="850d2faf8aaddbe994141a0cd9886cc5">
   <xsd:schema xmlns:xsd="http://www.w3.org/2001/XMLSchema" xmlns:xs="http://www.w3.org/2001/XMLSchema" xmlns:p="http://schemas.microsoft.com/office/2006/metadata/properties" xmlns:ns2="f1deac7a-c278-4e24-b1f2-d893a9d027f1" targetNamespace="http://schemas.microsoft.com/office/2006/metadata/properties" ma:root="true" ma:fieldsID="93fdaf049faefa43f4846670b9d31e51" ns2:_="">
     <xsd:import namespace="f1deac7a-c278-4e24-b1f2-d893a9d027f1"/>
@@ -3417,22 +3712,24 @@
 </ct:contentTypeSchema>
 </file>
 
-<file path=customXml/item2.xml><?xml version="1.0" encoding="utf-8"?>
-<?mso-contentType ?>
-<FormTemplates xmlns="http://schemas.microsoft.com/sharepoint/v3/contenttype/forms">
-  <Display>DocumentLibraryForm</Display>
-  <Edit>DocumentLibraryForm</Edit>
-  <New>DocumentLibraryForm</New>
-</FormTemplates>
+<file path=customXml/itemProps1.xml><?xml version="1.0" encoding="utf-8"?>
+<ds:datastoreItem xmlns:ds="http://schemas.openxmlformats.org/officeDocument/2006/customXml" ds:itemID="{24994100-30FA-44E3-85DC-A062E0F00248}">
+  <ds:schemaRefs>
+    <ds:schemaRef ds:uri="http://schemas.microsoft.com/office/2006/metadata/properties"/>
+    <ds:schemaRef ds:uri="http://schemas.microsoft.com/office/infopath/2007/PartnerControls"/>
+  </ds:schemaRefs>
+</ds:datastoreItem>
 </file>
 
-<file path=customXml/item3.xml><?xml version="1.0" encoding="utf-8"?>
-<p:properties xmlns:p="http://schemas.microsoft.com/office/2006/metadata/properties" xmlns:xsi="http://www.w3.org/2001/XMLSchema-instance" xmlns:pc="http://schemas.microsoft.com/office/infopath/2007/PartnerControls">
-  <documentManagement/>
-</p:properties>
+<file path=customXml/itemProps2.xml><?xml version="1.0" encoding="utf-8"?>
+<ds:datastoreItem xmlns:ds="http://schemas.openxmlformats.org/officeDocument/2006/customXml" ds:itemID="{37D4D213-567E-4B7D-ACB2-E7F24E7628F2}">
+  <ds:schemaRefs>
+    <ds:schemaRef ds:uri="http://schemas.microsoft.com/sharepoint/v3/contenttype/forms"/>
+  </ds:schemaRefs>
+</ds:datastoreItem>
 </file>
 
-<file path=customXml/itemProps1.xml><?xml version="1.0" encoding="utf-8"?>
+<file path=customXml/itemProps3.xml><?xml version="1.0" encoding="utf-8"?>
 <ds:datastoreItem xmlns:ds="http://schemas.openxmlformats.org/officeDocument/2006/customXml" ds:itemID="{B52CBEE0-33A6-4C39-8A0E-A4DB8BECBE0B}">
   <ds:schemaRefs>
     <ds:schemaRef ds:uri="http://schemas.microsoft.com/office/2006/metadata/contentType"/>
@@ -3448,21 +3745,4 @@
     <ds:schemaRef ds:uri="http://schemas.microsoft.com/internal/obd"/>
   </ds:schemaRefs>
 </ds:datastoreItem>
-</file>
-
-<file path=customXml/itemProps2.xml><?xml version="1.0" encoding="utf-8"?>
-<ds:datastoreItem xmlns:ds="http://schemas.openxmlformats.org/officeDocument/2006/customXml" ds:itemID="{37D4D213-567E-4B7D-ACB2-E7F24E7628F2}">
-  <ds:schemaRefs>
-    <ds:schemaRef ds:uri="http://schemas.microsoft.com/sharepoint/v3/contenttype/forms"/>
-  </ds:schemaRefs>
-</ds:datastoreItem>
-</file>
-
-<file path=customXml/itemProps3.xml><?xml version="1.0" encoding="utf-8"?>
-<ds:datastoreItem xmlns:ds="http://schemas.openxmlformats.org/officeDocument/2006/customXml" ds:itemID="{24994100-30FA-44E3-85DC-A062E0F00248}">
-  <ds:schemaRefs>
-    <ds:schemaRef ds:uri="http://schemas.microsoft.com/office/2006/metadata/properties"/>
-    <ds:schemaRef ds:uri="http://schemas.microsoft.com/office/infopath/2007/PartnerControls"/>
-  </ds:schemaRefs>
-</ds:datastoreItem>
 </file>
</xml_diff>